<commit_message>
docs: fixed fonts in database annotation
</commit_message>
<xml_diff>
--- a/docs/Описание БД.docx
+++ b/docs/Описание БД.docx
@@ -8,11 +8,449 @@
         <w:bidi w:val="0"/>
         <w:spacing w:lineRule="auto" w:line="276" w:before="0" w:after="140"/>
         <w:jc w:val="start"/>
-        <w:rPr/>
-      </w:pPr>
-      <w:r>
-        <w:rPr/>
+        <w:rPr>
+          <w:rFonts w:ascii="Times New Roman" w:hAnsi="Times New Roman"/>
+        </w:rPr>
+      </w:pPr>
+      <w:r>
+        <w:rPr>
+          <w:rFonts w:ascii="Times New Roman" w:hAnsi="Times New Roman"/>
+        </w:rPr>
         <w:t>1. Пользователи и доступ</w:t>
+      </w:r>
+    </w:p>
+    <w:p>
+      <w:pPr>
+        <w:pStyle w:val="Heading3"/>
+        <w:bidi w:val="0"/>
+        <w:spacing w:lineRule="auto" w:line="276" w:before="0" w:after="140"/>
+        <w:jc w:val="start"/>
+        <w:rPr/>
+      </w:pPr>
+      <w:r>
+        <w:rPr>
+          <w:rStyle w:val="Strong"/>
+          <w:rFonts w:ascii="Times New Roman" w:hAnsi="Times New Roman"/>
+          <w:b/>
+          <w:bCs/>
+          <w:i/>
+          <w:iCs/>
+        </w:rPr>
+        <w:t>1.1. Роль</w:t>
+      </w:r>
+    </w:p>
+    <w:p>
+      <w:pPr>
+        <w:pStyle w:val="BodyText"/>
+        <w:bidi w:val="0"/>
+        <w:jc w:val="start"/>
+        <w:rPr>
+          <w:rFonts w:ascii="Times New Roman" w:hAnsi="Times New Roman"/>
+        </w:rPr>
+      </w:pPr>
+      <w:r>
+        <w:rPr>
+          <w:rFonts w:ascii="Times New Roman" w:hAnsi="Times New Roman"/>
+        </w:rPr>
+        <w:t>Справочник ролей пользователей.</w:t>
+        <w:br/>
+        <w:t>Определяет уровень доступа (например: администратор, клиент, менеджер).</w:t>
+      </w:r>
+    </w:p>
+    <w:p>
+      <w:pPr>
+        <w:pStyle w:val="BodyText"/>
+        <w:bidi w:val="0"/>
+        <w:jc w:val="start"/>
+        <w:rPr/>
+      </w:pPr>
+      <w:r>
+        <w:rPr>
+          <w:rStyle w:val="Strong"/>
+          <w:rFonts w:ascii="Times New Roman" w:hAnsi="Times New Roman"/>
+          <w:b/>
+          <w:bCs/>
+        </w:rPr>
+        <w:t>Связи:</w:t>
+      </w:r>
+    </w:p>
+    <w:p>
+      <w:pPr>
+        <w:pStyle w:val="BodyText"/>
+        <w:numPr>
+          <w:ilvl w:val="0"/>
+          <w:numId w:val="2"/>
+        </w:numPr>
+        <w:tabs>
+          <w:tab w:val="left" w:pos="709" w:leader="none"/>
+        </w:tabs>
+        <w:bidi w:val="0"/>
+        <w:ind w:hanging="283" w:start="709"/>
+        <w:jc w:val="start"/>
+        <w:rPr/>
+      </w:pPr>
+      <w:r>
+        <w:rPr>
+          <w:rStyle w:val="SourceText"/>
+          <w:rFonts w:ascii="Times New Roman" w:hAnsi="Times New Roman"/>
+        </w:rPr>
+        <w:t>Роль (1) → (N) Пользователь</w:t>
+      </w:r>
+    </w:p>
+    <w:p>
+      <w:pPr>
+        <w:pStyle w:val="Heading3"/>
+        <w:bidi w:val="0"/>
+        <w:spacing w:lineRule="auto" w:line="276" w:before="0" w:after="140"/>
+        <w:jc w:val="start"/>
+        <w:rPr/>
+      </w:pPr>
+      <w:r>
+        <w:rPr>
+          <w:rStyle w:val="Strong"/>
+          <w:rFonts w:ascii="Times New Roman" w:hAnsi="Times New Roman"/>
+          <w:b/>
+          <w:bCs/>
+          <w:i/>
+          <w:iCs/>
+        </w:rPr>
+        <w:t>1.2. Пользователь</w:t>
+      </w:r>
+    </w:p>
+    <w:p>
+      <w:pPr>
+        <w:pStyle w:val="BodyText"/>
+        <w:bidi w:val="0"/>
+        <w:jc w:val="start"/>
+        <w:rPr>
+          <w:rFonts w:ascii="Times New Roman" w:hAnsi="Times New Roman"/>
+        </w:rPr>
+      </w:pPr>
+      <w:r>
+        <w:rPr>
+          <w:rFonts w:ascii="Times New Roman" w:hAnsi="Times New Roman"/>
+        </w:rPr>
+        <w:t>Хранит учетные записи пользователей системы.</w:t>
+      </w:r>
+    </w:p>
+    <w:p>
+      <w:pPr>
+        <w:pStyle w:val="BodyText"/>
+        <w:bidi w:val="0"/>
+        <w:jc w:val="start"/>
+        <w:rPr/>
+      </w:pPr>
+      <w:r>
+        <w:rPr>
+          <w:rStyle w:val="Strong"/>
+          <w:rFonts w:ascii="Times New Roman" w:hAnsi="Times New Roman"/>
+        </w:rPr>
+        <w:t>Поля:</w:t>
+      </w:r>
+    </w:p>
+    <w:p>
+      <w:pPr>
+        <w:pStyle w:val="BodyText"/>
+        <w:numPr>
+          <w:ilvl w:val="0"/>
+          <w:numId w:val="3"/>
+        </w:numPr>
+        <w:tabs>
+          <w:tab w:val="left" w:pos="709" w:leader="none"/>
+        </w:tabs>
+        <w:bidi w:val="0"/>
+        <w:spacing w:before="0" w:after="0"/>
+        <w:ind w:hanging="283" w:start="709"/>
+        <w:jc w:val="start"/>
+        <w:rPr>
+          <w:rFonts w:ascii="Times New Roman" w:hAnsi="Times New Roman"/>
+        </w:rPr>
+      </w:pPr>
+      <w:r>
+        <w:rPr>
+          <w:rFonts w:ascii="Times New Roman" w:hAnsi="Times New Roman"/>
+        </w:rPr>
+        <w:t xml:space="preserve">логин и пароль </w:t>
+      </w:r>
+    </w:p>
+    <w:p>
+      <w:pPr>
+        <w:pStyle w:val="BodyText"/>
+        <w:numPr>
+          <w:ilvl w:val="0"/>
+          <w:numId w:val="3"/>
+        </w:numPr>
+        <w:tabs>
+          <w:tab w:val="left" w:pos="709" w:leader="none"/>
+        </w:tabs>
+        <w:bidi w:val="0"/>
+        <w:spacing w:before="0" w:after="0"/>
+        <w:ind w:hanging="283" w:start="709"/>
+        <w:jc w:val="start"/>
+        <w:rPr>
+          <w:rFonts w:ascii="Times New Roman" w:hAnsi="Times New Roman"/>
+        </w:rPr>
+      </w:pPr>
+      <w:r>
+        <w:rPr>
+          <w:rFonts w:ascii="Times New Roman" w:hAnsi="Times New Roman"/>
+        </w:rPr>
+        <w:t xml:space="preserve">имя пользователя </w:t>
+      </w:r>
+    </w:p>
+    <w:p>
+      <w:pPr>
+        <w:pStyle w:val="BodyText"/>
+        <w:numPr>
+          <w:ilvl w:val="0"/>
+          <w:numId w:val="3"/>
+        </w:numPr>
+        <w:tabs>
+          <w:tab w:val="left" w:pos="709" w:leader="none"/>
+        </w:tabs>
+        <w:bidi w:val="0"/>
+        <w:ind w:hanging="283" w:start="709"/>
+        <w:jc w:val="start"/>
+        <w:rPr>
+          <w:rFonts w:ascii="Times New Roman" w:hAnsi="Times New Roman"/>
+        </w:rPr>
+      </w:pPr>
+      <w:r>
+        <w:rPr>
+          <w:rFonts w:ascii="Times New Roman" w:hAnsi="Times New Roman"/>
+        </w:rPr>
+        <w:t xml:space="preserve">ссылка на роль </w:t>
+      </w:r>
+    </w:p>
+    <w:p>
+      <w:pPr>
+        <w:pStyle w:val="BodyText"/>
+        <w:bidi w:val="0"/>
+        <w:jc w:val="start"/>
+        <w:rPr/>
+      </w:pPr>
+      <w:r>
+        <w:rPr>
+          <w:rStyle w:val="Strong"/>
+          <w:rFonts w:ascii="Times New Roman" w:hAnsi="Times New Roman"/>
+        </w:rPr>
+        <w:t>Связи:</w:t>
+      </w:r>
+    </w:p>
+    <w:p>
+      <w:pPr>
+        <w:pStyle w:val="BodyText"/>
+        <w:numPr>
+          <w:ilvl w:val="0"/>
+          <w:numId w:val="4"/>
+        </w:numPr>
+        <w:tabs>
+          <w:tab w:val="left" w:pos="709" w:leader="none"/>
+        </w:tabs>
+        <w:bidi w:val="0"/>
+        <w:spacing w:before="0" w:after="0"/>
+        <w:ind w:hanging="283" w:start="709"/>
+        <w:jc w:val="start"/>
+        <w:rPr/>
+      </w:pPr>
+      <w:r>
+        <w:rPr>
+          <w:rStyle w:val="SourceText"/>
+        </w:rPr>
+        <w:t>Пользователь (N) → (1) Роль</w:t>
+      </w:r>
+    </w:p>
+    <w:p>
+      <w:pPr>
+        <w:pStyle w:val="BodyText"/>
+        <w:numPr>
+          <w:ilvl w:val="0"/>
+          <w:numId w:val="4"/>
+        </w:numPr>
+        <w:tabs>
+          <w:tab w:val="left" w:pos="709" w:leader="none"/>
+        </w:tabs>
+        <w:bidi w:val="0"/>
+        <w:spacing w:before="0" w:after="0"/>
+        <w:ind w:hanging="283" w:start="709"/>
+        <w:jc w:val="start"/>
+        <w:rPr/>
+      </w:pPr>
+      <w:r>
+        <w:rPr>
+          <w:rStyle w:val="SourceText"/>
+        </w:rPr>
+        <w:t>Пользователь (1) → (N) Скидка_Пользователя</w:t>
+      </w:r>
+      <w:r>
+        <w:rPr/>
+        <w:t xml:space="preserve"> </w:t>
+      </w:r>
+    </w:p>
+    <w:p>
+      <w:pPr>
+        <w:pStyle w:val="BodyText"/>
+        <w:numPr>
+          <w:ilvl w:val="0"/>
+          <w:numId w:val="4"/>
+        </w:numPr>
+        <w:tabs>
+          <w:tab w:val="left" w:pos="709" w:leader="none"/>
+        </w:tabs>
+        <w:bidi w:val="0"/>
+        <w:spacing w:before="0" w:after="0"/>
+        <w:ind w:hanging="283" w:start="709"/>
+        <w:jc w:val="start"/>
+        <w:rPr/>
+      </w:pPr>
+      <w:r>
+        <w:rPr>
+          <w:rStyle w:val="SourceText"/>
+        </w:rPr>
+        <w:t>Пользователь (1) → (N) Крозина</w:t>
+      </w:r>
+      <w:r>
+        <w:rPr/>
+        <w:t xml:space="preserve"> </w:t>
+      </w:r>
+    </w:p>
+    <w:p>
+      <w:pPr>
+        <w:pStyle w:val="BodyText"/>
+        <w:numPr>
+          <w:ilvl w:val="0"/>
+          <w:numId w:val="4"/>
+        </w:numPr>
+        <w:tabs>
+          <w:tab w:val="left" w:pos="709" w:leader="none"/>
+        </w:tabs>
+        <w:bidi w:val="0"/>
+        <w:ind w:hanging="283" w:start="709"/>
+        <w:jc w:val="start"/>
+        <w:rPr/>
+      </w:pPr>
+      <w:r>
+        <w:rPr>
+          <w:rStyle w:val="SourceText"/>
+        </w:rPr>
+        <w:t>Пользователь (1) → (N) Заказ</w:t>
+      </w:r>
+      <w:r>
+        <w:rPr/>
+        <w:t xml:space="preserve"> </w:t>
+      </w:r>
+    </w:p>
+    <w:p>
+      <w:pPr>
+        <w:pStyle w:val="Heading3"/>
+        <w:bidi w:val="0"/>
+        <w:spacing w:lineRule="auto" w:line="276" w:before="0" w:after="140"/>
+        <w:jc w:val="start"/>
+        <w:rPr/>
+      </w:pPr>
+      <w:r>
+        <w:rPr>
+          <w:rStyle w:val="Strong"/>
+          <w:b/>
+          <w:bCs/>
+        </w:rPr>
+        <w:t>1.3. UserDiscount</w:t>
+      </w:r>
+    </w:p>
+    <w:p>
+      <w:pPr>
+        <w:pStyle w:val="BodyText"/>
+        <w:bidi w:val="0"/>
+        <w:jc w:val="start"/>
+        <w:rPr/>
+      </w:pPr>
+      <w:r>
+        <w:rPr/>
+        <w:t>Содержит персональные скидки пользователей с периодом действия.</w:t>
+      </w:r>
+    </w:p>
+    <w:p>
+      <w:pPr>
+        <w:pStyle w:val="BodyText"/>
+        <w:bidi w:val="0"/>
+        <w:jc w:val="start"/>
+        <w:rPr/>
+      </w:pPr>
+      <w:r>
+        <w:rPr>
+          <w:rStyle w:val="Strong"/>
+        </w:rPr>
+        <w:t>Связи:</w:t>
+      </w:r>
+    </w:p>
+    <w:p>
+      <w:pPr>
+        <w:pStyle w:val="BodyText"/>
+        <w:numPr>
+          <w:ilvl w:val="0"/>
+          <w:numId w:val="5"/>
+        </w:numPr>
+        <w:tabs>
+          <w:tab w:val="left" w:pos="709" w:leader="none"/>
+        </w:tabs>
+        <w:bidi w:val="0"/>
+        <w:spacing w:before="0" w:after="0"/>
+        <w:ind w:hanging="283" w:start="709"/>
+        <w:jc w:val="start"/>
+        <w:rPr/>
+      </w:pPr>
+      <w:r>
+        <w:rPr>
+          <w:rStyle w:val="SourceText"/>
+        </w:rPr>
+        <w:t>UserDiscount (N) → (1) User</w:t>
+      </w:r>
+      <w:r>
+        <w:rPr/>
+        <w:t xml:space="preserve"> </w:t>
+      </w:r>
+    </w:p>
+    <w:p>
+      <w:pPr>
+        <w:pStyle w:val="BodyText"/>
+        <w:numPr>
+          <w:ilvl w:val="0"/>
+          <w:numId w:val="5"/>
+        </w:numPr>
+        <w:tabs>
+          <w:tab w:val="left" w:pos="709" w:leader="none"/>
+        </w:tabs>
+        <w:bidi w:val="0"/>
+        <w:ind w:hanging="283" w:start="709"/>
+        <w:jc w:val="start"/>
+        <w:rPr/>
+      </w:pPr>
+      <w:r>
+        <w:rPr/>
+        <w:t>При удалении пользователя скидки удаляются (</w:t>
+      </w:r>
+      <w:r>
+        <w:rPr>
+          <w:rStyle w:val="SourceText"/>
+        </w:rPr>
+        <w:t>ON DELETE CASCADE</w:t>
+      </w:r>
+      <w:r>
+        <w:rPr/>
+        <w:t xml:space="preserve">) </w:t>
+      </w:r>
+    </w:p>
+    <w:p>
+      <w:pPr>
+        <w:pStyle w:val="Heading1"/>
+        <w:bidi w:val="0"/>
+        <w:spacing w:lineRule="auto" w:line="276" w:before="0" w:after="140"/>
+        <w:jc w:val="start"/>
+        <w:rPr/>
+      </w:pPr>
+      <w:r>
+        <w:rPr/>
+        <w:t>2. Товары (препараты)</w:t>
       </w:r>
     </w:p>
     <w:p>
@@ -31,21 +469,19 @@
           <w:i/>
           <w:iCs/>
         </w:rPr>
-        <w:t>1.1. Роль</w:t>
-      </w:r>
-    </w:p>
-    <w:p>
-      <w:pPr>
-        <w:pStyle w:val="BodyText"/>
-        <w:bidi w:val="0"/>
-        <w:jc w:val="start"/>
-        <w:rPr/>
-      </w:pPr>
-      <w:r>
-        <w:rPr/>
-        <w:t>Справочник ролей пользователей.</w:t>
-        <w:br/>
-        <w:t>Определяет уровень доступа (например: администратор, клиент, менеджер).</w:t>
+        <w:t>2.1. Производитель</w:t>
+      </w:r>
+    </w:p>
+    <w:p>
+      <w:pPr>
+        <w:pStyle w:val="BodyText"/>
+        <w:bidi w:val="0"/>
+        <w:jc w:val="start"/>
+        <w:rPr/>
+      </w:pPr>
+      <w:r>
+        <w:rPr/>
+        <w:t>Производители препаратов.</w:t>
       </w:r>
     </w:p>
     <w:p>
@@ -58,8 +494,6 @@
       <w:r>
         <w:rPr>
           <w:rStyle w:val="Strong"/>
-          <w:b/>
-          <w:bCs/>
         </w:rPr>
         <w:t>Связи:</w:t>
       </w:r>
@@ -69,10 +503,9 @@
         <w:pStyle w:val="BodyText"/>
         <w:numPr>
           <w:ilvl w:val="0"/>
-          <w:numId w:val="2"/>
+          <w:numId w:val="6"/>
         </w:numPr>
         <w:tabs>
-          <w:tab w:val="clear" w:pos="709"/>
           <w:tab w:val="left" w:pos="709" w:leader="none"/>
         </w:tabs>
         <w:bidi w:val="0"/>
@@ -84,19 +517,7 @@
         <w:rPr>
           <w:rStyle w:val="SourceText"/>
         </w:rPr>
-        <w:t>Роль</w:t>
-      </w:r>
-      <w:r>
-        <w:rPr>
-          <w:rStyle w:val="SourceText"/>
-        </w:rPr>
-        <w:t xml:space="preserve"> (1) → (N) </w:t>
-      </w:r>
-      <w:r>
-        <w:rPr>
-          <w:rStyle w:val="SourceText"/>
-        </w:rPr>
-        <w:t>Пользователь</w:t>
+        <w:t>Производитель (1) → (N) Препарат</w:t>
       </w:r>
     </w:p>
     <w:p>
@@ -115,19 +536,19 @@
           <w:i/>
           <w:iCs/>
         </w:rPr>
-        <w:t>1.2. Пользователь</w:t>
-      </w:r>
-    </w:p>
-    <w:p>
-      <w:pPr>
-        <w:pStyle w:val="BodyText"/>
-        <w:bidi w:val="0"/>
-        <w:jc w:val="start"/>
-        <w:rPr/>
-      </w:pPr>
-      <w:r>
-        <w:rPr/>
-        <w:t>Хранит учетные записи пользователей системы.</w:t>
+        <w:t>2.2. Тип_Лекарства</w:t>
+      </w:r>
+    </w:p>
+    <w:p>
+      <w:pPr>
+        <w:pStyle w:val="BodyText"/>
+        <w:bidi w:val="0"/>
+        <w:jc w:val="start"/>
+        <w:rPr/>
+      </w:pPr>
+      <w:r>
+        <w:rPr/>
+        <w:t>Иерархический справочник типов препаратов (категорий).</w:t>
       </w:r>
     </w:p>
     <w:p>
@@ -141,7 +562,7 @@
         <w:rPr>
           <w:rStyle w:val="Strong"/>
         </w:rPr>
-        <w:t>Поля:</w:t>
+        <w:t>Особенность:</w:t>
       </w:r>
     </w:p>
     <w:p>
@@ -149,10 +570,53 @@
         <w:pStyle w:val="BodyText"/>
         <w:numPr>
           <w:ilvl w:val="0"/>
-          <w:numId w:val="3"/>
+          <w:numId w:val="7"/>
         </w:numPr>
         <w:tabs>
-          <w:tab w:val="clear" w:pos="709"/>
+          <w:tab w:val="left" w:pos="709" w:leader="none"/>
+        </w:tabs>
+        <w:bidi w:val="0"/>
+        <w:ind w:hanging="283" w:start="709"/>
+        <w:jc w:val="start"/>
+        <w:rPr/>
+      </w:pPr>
+      <w:r>
+        <w:rPr/>
+        <w:t>Самоссылка (</w:t>
+      </w:r>
+      <w:r>
+        <w:rPr>
+          <w:rStyle w:val="SourceText"/>
+        </w:rPr>
+        <w:t>parentID</w:t>
+      </w:r>
+      <w:r>
+        <w:rPr/>
+        <w:t xml:space="preserve">) позволяет строить дерево категорий </w:t>
+      </w:r>
+    </w:p>
+    <w:p>
+      <w:pPr>
+        <w:pStyle w:val="BodyText"/>
+        <w:bidi w:val="0"/>
+        <w:jc w:val="start"/>
+        <w:rPr/>
+      </w:pPr>
+      <w:r>
+        <w:rPr>
+          <w:rStyle w:val="Strong"/>
+        </w:rPr>
+        <w:t>Связи:</w:t>
+      </w:r>
+    </w:p>
+    <w:p>
+      <w:pPr>
+        <w:pStyle w:val="BodyText"/>
+        <w:numPr>
+          <w:ilvl w:val="0"/>
+          <w:numId w:val="8"/>
+        </w:numPr>
+        <w:tabs>
           <w:tab w:val="left" w:pos="709" w:leader="none"/>
         </w:tabs>
         <w:bidi w:val="0"/>
@@ -162,8 +626,14 @@
         <w:rPr/>
       </w:pPr>
       <w:r>
-        <w:rPr/>
-        <w:t xml:space="preserve">логин и пароль </w:t>
+        <w:rPr>
+          <w:rStyle w:val="SourceText"/>
+        </w:rPr>
+        <w:t xml:space="preserve">Тип_Лекарства (1) → (N) Тип_Лекарства </w:t>
+      </w:r>
+      <w:r>
+        <w:rPr/>
+        <w:t xml:space="preserve">(иерархия) </w:t>
       </w:r>
     </w:p>
     <w:p>
@@ -171,334 +641,25 @@
         <w:pStyle w:val="BodyText"/>
         <w:numPr>
           <w:ilvl w:val="0"/>
-          <w:numId w:val="3"/>
+          <w:numId w:val="8"/>
         </w:numPr>
         <w:tabs>
-          <w:tab w:val="clear" w:pos="709"/>
           <w:tab w:val="left" w:pos="709" w:leader="none"/>
         </w:tabs>
         <w:bidi w:val="0"/>
-        <w:spacing w:before="0" w:after="0"/>
         <w:ind w:hanging="283" w:start="709"/>
         <w:jc w:val="start"/>
         <w:rPr/>
       </w:pPr>
       <w:r>
-        <w:rPr/>
-        <w:t xml:space="preserve">имя пользователя </w:t>
-      </w:r>
-    </w:p>
-    <w:p>
-      <w:pPr>
-        <w:pStyle w:val="BodyText"/>
-        <w:numPr>
-          <w:ilvl w:val="0"/>
-          <w:numId w:val="3"/>
-        </w:numPr>
-        <w:tabs>
-          <w:tab w:val="clear" w:pos="709"/>
-          <w:tab w:val="left" w:pos="709" w:leader="none"/>
-        </w:tabs>
-        <w:bidi w:val="0"/>
-        <w:ind w:hanging="283" w:start="709"/>
-        <w:jc w:val="start"/>
-        <w:rPr/>
-      </w:pPr>
-      <w:r>
-        <w:rPr/>
-        <w:t xml:space="preserve">ссылка на роль </w:t>
-      </w:r>
-    </w:p>
-    <w:p>
-      <w:pPr>
-        <w:pStyle w:val="BodyText"/>
-        <w:bidi w:val="0"/>
-        <w:jc w:val="start"/>
-        <w:rPr/>
-      </w:pPr>
-      <w:r>
-        <w:rPr>
-          <w:rStyle w:val="Strong"/>
-        </w:rPr>
-        <w:t>Связи:</w:t>
-      </w:r>
-    </w:p>
-    <w:p>
-      <w:pPr>
-        <w:pStyle w:val="BodyText"/>
-        <w:numPr>
-          <w:ilvl w:val="0"/>
-          <w:numId w:val="4"/>
-        </w:numPr>
-        <w:tabs>
-          <w:tab w:val="clear" w:pos="709"/>
-          <w:tab w:val="left" w:pos="709" w:leader="none"/>
-        </w:tabs>
-        <w:bidi w:val="0"/>
-        <w:spacing w:before="0" w:after="0"/>
-        <w:ind w:hanging="283" w:start="709"/>
-        <w:jc w:val="start"/>
-        <w:rPr/>
-      </w:pPr>
-      <w:r>
         <w:rPr>
           <w:rStyle w:val="SourceText"/>
         </w:rPr>
-        <w:t>Пользователь</w:t>
-      </w:r>
-      <w:r>
-        <w:rPr>
-          <w:rStyle w:val="SourceText"/>
-        </w:rPr>
-        <w:t xml:space="preserve"> (N) → (1) </w:t>
-      </w:r>
-      <w:r>
-        <w:rPr>
-          <w:rStyle w:val="SourceText"/>
-        </w:rPr>
-        <w:t>Роль</w:t>
-      </w:r>
-    </w:p>
-    <w:p>
-      <w:pPr>
-        <w:pStyle w:val="BodyText"/>
-        <w:numPr>
-          <w:ilvl w:val="0"/>
-          <w:numId w:val="4"/>
-        </w:numPr>
-        <w:tabs>
-          <w:tab w:val="clear" w:pos="709"/>
-          <w:tab w:val="left" w:pos="709" w:leader="none"/>
-        </w:tabs>
-        <w:bidi w:val="0"/>
-        <w:spacing w:before="0" w:after="0"/>
-        <w:ind w:hanging="283" w:start="709"/>
-        <w:jc w:val="start"/>
-        <w:rPr/>
-      </w:pPr>
-      <w:r>
-        <w:rPr>
-          <w:rStyle w:val="SourceText"/>
-        </w:rPr>
-        <w:t xml:space="preserve">Пользователь </w:t>
-      </w:r>
-      <w:r>
-        <w:rPr>
-          <w:rStyle w:val="SourceText"/>
-        </w:rPr>
-        <w:t xml:space="preserve">(1) → (N) </w:t>
-      </w:r>
-      <w:r>
-        <w:rPr>
-          <w:rStyle w:val="SourceText"/>
-        </w:rPr>
-        <w:t>Скидка_Пользователя</w:t>
+        <w:t>Тип_Лекарства (1) → (N) Препарат</w:t>
       </w:r>
       <w:r>
         <w:rPr/>
         <w:t xml:space="preserve"> </w:t>
-      </w:r>
-    </w:p>
-    <w:p>
-      <w:pPr>
-        <w:pStyle w:val="BodyText"/>
-        <w:numPr>
-          <w:ilvl w:val="0"/>
-          <w:numId w:val="4"/>
-        </w:numPr>
-        <w:tabs>
-          <w:tab w:val="clear" w:pos="709"/>
-          <w:tab w:val="left" w:pos="709" w:leader="none"/>
-        </w:tabs>
-        <w:bidi w:val="0"/>
-        <w:spacing w:before="0" w:after="0"/>
-        <w:ind w:hanging="283" w:start="709"/>
-        <w:jc w:val="start"/>
-        <w:rPr/>
-      </w:pPr>
-      <w:r>
-        <w:rPr>
-          <w:rStyle w:val="SourceText"/>
-        </w:rPr>
-        <w:t xml:space="preserve">Пользователь </w:t>
-      </w:r>
-      <w:r>
-        <w:rPr>
-          <w:rStyle w:val="SourceText"/>
-        </w:rPr>
-        <w:t xml:space="preserve">(1) → (N) </w:t>
-      </w:r>
-      <w:r>
-        <w:rPr>
-          <w:rStyle w:val="SourceText"/>
-        </w:rPr>
-        <w:t>Крозина</w:t>
-      </w:r>
-      <w:r>
-        <w:rPr/>
-        <w:t xml:space="preserve"> </w:t>
-      </w:r>
-    </w:p>
-    <w:p>
-      <w:pPr>
-        <w:pStyle w:val="BodyText"/>
-        <w:numPr>
-          <w:ilvl w:val="0"/>
-          <w:numId w:val="4"/>
-        </w:numPr>
-        <w:tabs>
-          <w:tab w:val="clear" w:pos="709"/>
-          <w:tab w:val="left" w:pos="709" w:leader="none"/>
-        </w:tabs>
-        <w:bidi w:val="0"/>
-        <w:ind w:hanging="283" w:start="709"/>
-        <w:jc w:val="start"/>
-        <w:rPr/>
-      </w:pPr>
-      <w:r>
-        <w:rPr>
-          <w:rStyle w:val="SourceText"/>
-        </w:rPr>
-        <w:t>Пользователь</w:t>
-      </w:r>
-      <w:r>
-        <w:rPr>
-          <w:rStyle w:val="SourceText"/>
-        </w:rPr>
-        <w:t xml:space="preserve"> (1) → (N) </w:t>
-      </w:r>
-      <w:r>
-        <w:rPr>
-          <w:rStyle w:val="SourceText"/>
-        </w:rPr>
-        <w:t>Заказ</w:t>
-      </w:r>
-      <w:r>
-        <w:rPr/>
-        <w:t xml:space="preserve"> </w:t>
-      </w:r>
-    </w:p>
-    <w:p>
-      <w:pPr>
-        <w:pStyle w:val="Heading3"/>
-        <w:bidi w:val="0"/>
-        <w:spacing w:lineRule="auto" w:line="276" w:before="0" w:after="140"/>
-        <w:jc w:val="start"/>
-        <w:rPr/>
-      </w:pPr>
-      <w:r>
-        <w:rPr>
-          <w:rStyle w:val="Strong"/>
-          <w:b/>
-          <w:bCs/>
-        </w:rPr>
-        <w:t xml:space="preserve">1.3. </w:t>
-      </w:r>
-      <w:r>
-        <w:rPr>
-          <w:rStyle w:val="Strong"/>
-          <w:b/>
-          <w:bCs/>
-        </w:rPr>
-        <w:t>UserDiscount</w:t>
-      </w:r>
-    </w:p>
-    <w:p>
-      <w:pPr>
-        <w:pStyle w:val="BodyText"/>
-        <w:bidi w:val="0"/>
-        <w:jc w:val="start"/>
-        <w:rPr/>
-      </w:pPr>
-      <w:r>
-        <w:rPr/>
-        <w:t>Содержит персональные скидки пользователей с периодом действия.</w:t>
-      </w:r>
-    </w:p>
-    <w:p>
-      <w:pPr>
-        <w:pStyle w:val="BodyText"/>
-        <w:bidi w:val="0"/>
-        <w:jc w:val="start"/>
-        <w:rPr/>
-      </w:pPr>
-      <w:r>
-        <w:rPr>
-          <w:rStyle w:val="Strong"/>
-        </w:rPr>
-        <w:t>Связи:</w:t>
-      </w:r>
-    </w:p>
-    <w:p>
-      <w:pPr>
-        <w:pStyle w:val="BodyText"/>
-        <w:numPr>
-          <w:ilvl w:val="0"/>
-          <w:numId w:val="5"/>
-        </w:numPr>
-        <w:tabs>
-          <w:tab w:val="clear" w:pos="709"/>
-          <w:tab w:val="left" w:pos="709" w:leader="none"/>
-        </w:tabs>
-        <w:bidi w:val="0"/>
-        <w:spacing w:before="0" w:after="0"/>
-        <w:ind w:hanging="283" w:start="709"/>
-        <w:jc w:val="start"/>
-        <w:rPr/>
-      </w:pPr>
-      <w:r>
-        <w:rPr>
-          <w:rStyle w:val="SourceText"/>
-        </w:rPr>
-        <w:t>UserDiscount (N) → (1) User</w:t>
-      </w:r>
-      <w:r>
-        <w:rPr/>
-        <w:t xml:space="preserve"> </w:t>
-      </w:r>
-    </w:p>
-    <w:p>
-      <w:pPr>
-        <w:pStyle w:val="BodyText"/>
-        <w:numPr>
-          <w:ilvl w:val="0"/>
-          <w:numId w:val="5"/>
-        </w:numPr>
-        <w:tabs>
-          <w:tab w:val="clear" w:pos="709"/>
-          <w:tab w:val="left" w:pos="709" w:leader="none"/>
-        </w:tabs>
-        <w:bidi w:val="0"/>
-        <w:ind w:hanging="283" w:start="709"/>
-        <w:jc w:val="start"/>
-        <w:rPr/>
-      </w:pPr>
-      <w:r>
-        <w:rPr/>
-        <w:t>При удалении пользователя скидки удаляются (</w:t>
-      </w:r>
-      <w:r>
-        <w:rPr>
-          <w:rStyle w:val="SourceText"/>
-        </w:rPr>
-        <w:t>ON DELETE CASCADE</w:t>
-      </w:r>
-      <w:r>
-        <w:rPr/>
-        <w:t xml:space="preserve">) </w:t>
-      </w:r>
-    </w:p>
-    <w:p>
-      <w:pPr>
-        <w:pStyle w:val="Heading1"/>
-        <w:bidi w:val="0"/>
-        <w:spacing w:lineRule="auto" w:line="276" w:before="0" w:after="140"/>
-        <w:jc w:val="start"/>
-        <w:rPr/>
-      </w:pPr>
-      <w:r>
-        <w:rPr/>
-        <w:t>2. Товары (препараты)</w:t>
       </w:r>
     </w:p>
     <w:p>
@@ -517,19 +678,19 @@
           <w:i/>
           <w:iCs/>
         </w:rPr>
-        <w:t>2.1. Производитель</w:t>
-      </w:r>
-    </w:p>
-    <w:p>
-      <w:pPr>
-        <w:pStyle w:val="BodyText"/>
-        <w:bidi w:val="0"/>
-        <w:jc w:val="start"/>
-        <w:rPr/>
-      </w:pPr>
-      <w:r>
-        <w:rPr/>
-        <w:t>Производители препаратов.</w:t>
+        <w:t>2.3. Препарат</w:t>
+      </w:r>
+    </w:p>
+    <w:p>
+      <w:pPr>
+        <w:pStyle w:val="BodyText"/>
+        <w:bidi w:val="0"/>
+        <w:jc w:val="start"/>
+        <w:rPr/>
+      </w:pPr>
+      <w:r>
+        <w:rPr/>
+        <w:t>Основная таблица препаратов.</w:t>
       </w:r>
     </w:p>
     <w:p>
@@ -543,7 +704,7 @@
         <w:rPr>
           <w:rStyle w:val="Strong"/>
         </w:rPr>
-        <w:t>Связи:</w:t>
+        <w:t>Содержит:</w:t>
       </w:r>
     </w:p>
     <w:p>
@@ -551,34 +712,237 @@
         <w:pStyle w:val="BodyText"/>
         <w:numPr>
           <w:ilvl w:val="0"/>
-          <w:numId w:val="6"/>
+          <w:numId w:val="9"/>
         </w:numPr>
         <w:tabs>
-          <w:tab w:val="clear" w:pos="709"/>
           <w:tab w:val="left" w:pos="709" w:leader="none"/>
         </w:tabs>
         <w:bidi w:val="0"/>
+        <w:spacing w:before="0" w:after="0"/>
         <w:ind w:hanging="283" w:start="709"/>
         <w:jc w:val="start"/>
         <w:rPr/>
       </w:pPr>
       <w:r>
+        <w:rPr/>
+        <w:t xml:space="preserve">название, описание </w:t>
+      </w:r>
+    </w:p>
+    <w:p>
+      <w:pPr>
+        <w:pStyle w:val="BodyText"/>
+        <w:numPr>
+          <w:ilvl w:val="0"/>
+          <w:numId w:val="9"/>
+        </w:numPr>
+        <w:tabs>
+          <w:tab w:val="left" w:pos="709" w:leader="none"/>
+        </w:tabs>
+        <w:bidi w:val="0"/>
+        <w:spacing w:before="0" w:after="0"/>
+        <w:ind w:hanging="283" w:start="709"/>
+        <w:jc w:val="start"/>
+        <w:rPr/>
+      </w:pPr>
+      <w:r>
+        <w:rPr/>
+        <w:t xml:space="preserve">международное наименование (INN) </w:t>
+      </w:r>
+    </w:p>
+    <w:p>
+      <w:pPr>
+        <w:pStyle w:val="BodyText"/>
+        <w:numPr>
+          <w:ilvl w:val="0"/>
+          <w:numId w:val="9"/>
+        </w:numPr>
+        <w:tabs>
+          <w:tab w:val="left" w:pos="709" w:leader="none"/>
+        </w:tabs>
+        <w:bidi w:val="0"/>
+        <w:spacing w:before="0" w:after="0"/>
+        <w:ind w:hanging="283" w:start="709"/>
+        <w:jc w:val="start"/>
+        <w:rPr/>
+      </w:pPr>
+      <w:r>
+        <w:rPr/>
+        <w:t xml:space="preserve">дозировку </w:t>
+      </w:r>
+    </w:p>
+    <w:p>
+      <w:pPr>
+        <w:pStyle w:val="BodyText"/>
+        <w:numPr>
+          <w:ilvl w:val="0"/>
+          <w:numId w:val="9"/>
+        </w:numPr>
+        <w:tabs>
+          <w:tab w:val="left" w:pos="709" w:leader="none"/>
+        </w:tabs>
+        <w:bidi w:val="0"/>
+        <w:spacing w:before="0" w:after="0"/>
+        <w:ind w:hanging="283" w:start="709"/>
+        <w:jc w:val="start"/>
+        <w:rPr/>
+      </w:pPr>
+      <w:r>
+        <w:rPr/>
+        <w:t xml:space="preserve">производителя </w:t>
+      </w:r>
+    </w:p>
+    <w:p>
+      <w:pPr>
+        <w:pStyle w:val="BodyText"/>
+        <w:numPr>
+          <w:ilvl w:val="0"/>
+          <w:numId w:val="9"/>
+        </w:numPr>
+        <w:tabs>
+          <w:tab w:val="left" w:pos="709" w:leader="none"/>
+        </w:tabs>
+        <w:bidi w:val="0"/>
+        <w:ind w:hanging="283" w:start="709"/>
+        <w:jc w:val="start"/>
+        <w:rPr/>
+      </w:pPr>
+      <w:r>
+        <w:rPr/>
+        <w:t xml:space="preserve">тип препарата </w:t>
+      </w:r>
+    </w:p>
+    <w:p>
+      <w:pPr>
+        <w:pStyle w:val="BodyText"/>
+        <w:bidi w:val="0"/>
+        <w:jc w:val="start"/>
+        <w:rPr/>
+      </w:pPr>
+      <w:r>
+        <w:rPr>
+          <w:rStyle w:val="Strong"/>
+        </w:rPr>
+        <w:t>Связи:</w:t>
+      </w:r>
+    </w:p>
+    <w:p>
+      <w:pPr>
+        <w:pStyle w:val="BodyText"/>
+        <w:numPr>
+          <w:ilvl w:val="0"/>
+          <w:numId w:val="10"/>
+        </w:numPr>
+        <w:tabs>
+          <w:tab w:val="left" w:pos="709" w:leader="none"/>
+        </w:tabs>
+        <w:bidi w:val="0"/>
+        <w:spacing w:before="0" w:after="0"/>
+        <w:ind w:hanging="283" w:start="709"/>
+        <w:jc w:val="start"/>
+        <w:rPr/>
+      </w:pPr>
+      <w:r>
         <w:rPr>
           <w:rStyle w:val="SourceText"/>
         </w:rPr>
-        <w:t>Производитель</w:t>
-      </w:r>
+        <w:t>Препарат (N) → (1) Тип_Лекарства</w:t>
+      </w:r>
+      <w:r>
+        <w:rPr/>
+        <w:t xml:space="preserve"> </w:t>
+      </w:r>
+    </w:p>
+    <w:p>
+      <w:pPr>
+        <w:pStyle w:val="BodyText"/>
+        <w:numPr>
+          <w:ilvl w:val="0"/>
+          <w:numId w:val="10"/>
+        </w:numPr>
+        <w:tabs>
+          <w:tab w:val="left" w:pos="709" w:leader="none"/>
+        </w:tabs>
+        <w:bidi w:val="0"/>
+        <w:spacing w:before="0" w:after="0"/>
+        <w:ind w:hanging="283" w:start="709"/>
+        <w:jc w:val="start"/>
+        <w:rPr/>
+      </w:pPr>
       <w:r>
         <w:rPr>
           <w:rStyle w:val="SourceText"/>
         </w:rPr>
-        <w:t xml:space="preserve"> (1) → (N) </w:t>
-      </w:r>
+        <w:t>Препарат (N) → (1) Производитель</w:t>
+      </w:r>
+      <w:r>
+        <w:rPr/>
+        <w:t xml:space="preserve"> </w:t>
+      </w:r>
+    </w:p>
+    <w:p>
+      <w:pPr>
+        <w:pStyle w:val="BodyText"/>
+        <w:numPr>
+          <w:ilvl w:val="0"/>
+          <w:numId w:val="10"/>
+        </w:numPr>
+        <w:tabs>
+          <w:tab w:val="left" w:pos="709" w:leader="none"/>
+        </w:tabs>
+        <w:bidi w:val="0"/>
+        <w:spacing w:before="0" w:after="0"/>
+        <w:ind w:hanging="283" w:start="709"/>
+        <w:jc w:val="start"/>
+        <w:rPr/>
+      </w:pPr>
       <w:r>
         <w:rPr>
           <w:rStyle w:val="SourceText"/>
         </w:rPr>
-        <w:t>Препарат</w:t>
+        <w:t>Препарат (1) → (N) Партия</w:t>
+      </w:r>
+      <w:r>
+        <w:rPr/>
+        <w:t xml:space="preserve"> </w:t>
+      </w:r>
+    </w:p>
+    <w:p>
+      <w:pPr>
+        <w:pStyle w:val="BodyText"/>
+        <w:numPr>
+          <w:ilvl w:val="0"/>
+          <w:numId w:val="10"/>
+        </w:numPr>
+        <w:tabs>
+          <w:tab w:val="left" w:pos="709" w:leader="none"/>
+        </w:tabs>
+        <w:bidi w:val="0"/>
+        <w:ind w:hanging="283" w:start="709"/>
+        <w:jc w:val="start"/>
+        <w:rPr/>
+      </w:pPr>
+      <w:r>
+        <w:rPr>
+          <w:rStyle w:val="SourceText"/>
+        </w:rPr>
+        <w:t>Препарат (1) → (N) Элемент_Корзины</w:t>
+      </w:r>
+      <w:r>
+        <w:rPr/>
+        <w:t xml:space="preserve"> </w:t>
+      </w:r>
+    </w:p>
+    <w:p>
+      <w:pPr>
+        <w:pStyle w:val="Heading1"/>
+        <w:bidi w:val="0"/>
+        <w:spacing w:lineRule="auto" w:line="276" w:before="0" w:after="140"/>
+        <w:jc w:val="start"/>
+        <w:rPr/>
+      </w:pPr>
+      <w:r>
+        <w:rPr/>
+        <w:t>3. Поставки и склад</w:t>
       </w:r>
     </w:p>
     <w:p>
@@ -597,19 +961,19 @@
           <w:i/>
           <w:iCs/>
         </w:rPr>
-        <w:t>2.2. Тип_Лекарства</w:t>
-      </w:r>
-    </w:p>
-    <w:p>
-      <w:pPr>
-        <w:pStyle w:val="BodyText"/>
-        <w:bidi w:val="0"/>
-        <w:jc w:val="start"/>
-        <w:rPr/>
-      </w:pPr>
-      <w:r>
-        <w:rPr/>
-        <w:t>Иерархический справочник типов препаратов (категорий).</w:t>
+        <w:t>3.1. Поставщик</w:t>
+      </w:r>
+    </w:p>
+    <w:p>
+      <w:pPr>
+        <w:pStyle w:val="BodyText"/>
+        <w:bidi w:val="0"/>
+        <w:jc w:val="start"/>
+        <w:rPr/>
+      </w:pPr>
+      <w:r>
+        <w:rPr/>
+        <w:t>Поставщики товаров.</w:t>
       </w:r>
     </w:p>
     <w:p>
@@ -623,7 +987,7 @@
         <w:rPr>
           <w:rStyle w:val="Strong"/>
         </w:rPr>
-        <w:t>Особенность:</w:t>
+        <w:t>Связи:</w:t>
       </w:r>
     </w:p>
     <w:p>
@@ -631,10 +995,9 @@
         <w:pStyle w:val="BodyText"/>
         <w:numPr>
           <w:ilvl w:val="0"/>
-          <w:numId w:val="7"/>
+          <w:numId w:val="11"/>
         </w:numPr>
         <w:tabs>
-          <w:tab w:val="clear" w:pos="709"/>
           <w:tab w:val="left" w:pos="709" w:leader="none"/>
         </w:tabs>
         <w:bidi w:val="0"/>
@@ -643,111 +1006,10 @@
         <w:rPr/>
       </w:pPr>
       <w:r>
-        <w:rPr/>
-        <w:t>Самоссылка (</w:t>
-      </w:r>
-      <w:r>
         <w:rPr>
           <w:rStyle w:val="SourceText"/>
         </w:rPr>
-        <w:t>parentID</w:t>
-      </w:r>
-      <w:r>
-        <w:rPr/>
-        <w:t xml:space="preserve">) позволяет строить дерево категорий </w:t>
-      </w:r>
-    </w:p>
-    <w:p>
-      <w:pPr>
-        <w:pStyle w:val="BodyText"/>
-        <w:bidi w:val="0"/>
-        <w:jc w:val="start"/>
-        <w:rPr/>
-      </w:pPr>
-      <w:r>
-        <w:rPr>
-          <w:rStyle w:val="Strong"/>
-        </w:rPr>
-        <w:t>Связи:</w:t>
-      </w:r>
-    </w:p>
-    <w:p>
-      <w:pPr>
-        <w:pStyle w:val="BodyText"/>
-        <w:numPr>
-          <w:ilvl w:val="0"/>
-          <w:numId w:val="8"/>
-        </w:numPr>
-        <w:tabs>
-          <w:tab w:val="clear" w:pos="709"/>
-          <w:tab w:val="left" w:pos="709" w:leader="none"/>
-        </w:tabs>
-        <w:bidi w:val="0"/>
-        <w:spacing w:before="0" w:after="0"/>
-        <w:ind w:hanging="283" w:start="709"/>
-        <w:jc w:val="start"/>
-        <w:rPr/>
-      </w:pPr>
-      <w:r>
-        <w:rPr>
-          <w:rStyle w:val="SourceText"/>
-        </w:rPr>
-        <w:t>Тип_Лекарства</w:t>
-      </w:r>
-      <w:r>
-        <w:rPr>
-          <w:rStyle w:val="SourceText"/>
-        </w:rPr>
-        <w:t xml:space="preserve"> (1) → (N) </w:t>
-      </w:r>
-      <w:r>
-        <w:rPr>
-          <w:rStyle w:val="SourceText"/>
-        </w:rPr>
-        <w:t xml:space="preserve">Тип_Лекарства </w:t>
-      </w:r>
-      <w:r>
-        <w:rPr/>
-        <w:t xml:space="preserve">(иерархия) </w:t>
-      </w:r>
-    </w:p>
-    <w:p>
-      <w:pPr>
-        <w:pStyle w:val="BodyText"/>
-        <w:numPr>
-          <w:ilvl w:val="0"/>
-          <w:numId w:val="8"/>
-        </w:numPr>
-        <w:tabs>
-          <w:tab w:val="clear" w:pos="709"/>
-          <w:tab w:val="left" w:pos="709" w:leader="none"/>
-        </w:tabs>
-        <w:bidi w:val="0"/>
-        <w:ind w:hanging="283" w:start="709"/>
-        <w:jc w:val="start"/>
-        <w:rPr/>
-      </w:pPr>
-      <w:r>
-        <w:rPr>
-          <w:rStyle w:val="SourceText"/>
-        </w:rPr>
-        <w:t>Тип_Лекарства</w:t>
-      </w:r>
-      <w:r>
-        <w:rPr>
-          <w:rStyle w:val="SourceText"/>
-        </w:rPr>
-        <w:t xml:space="preserve"> (1) → (N) </w:t>
-      </w:r>
-      <w:r>
-        <w:rPr>
-          <w:rStyle w:val="SourceText"/>
-        </w:rPr>
-        <w:t>Препарат</w:t>
-      </w:r>
-      <w:r>
-        <w:rPr/>
-        <w:t xml:space="preserve"> </w:t>
+        <w:t>Поставщик (1) → (N) Поставка</w:t>
       </w:r>
     </w:p>
     <w:p>
@@ -766,19 +1028,19 @@
           <w:i/>
           <w:iCs/>
         </w:rPr>
-        <w:t>2.3. Препарат</w:t>
-      </w:r>
-    </w:p>
-    <w:p>
-      <w:pPr>
-        <w:pStyle w:val="BodyText"/>
-        <w:bidi w:val="0"/>
-        <w:jc w:val="start"/>
-        <w:rPr/>
-      </w:pPr>
-      <w:r>
-        <w:rPr/>
-        <w:t>Основная таблица препаратов.</w:t>
+        <w:t>3.2. Поставка</w:t>
+      </w:r>
+    </w:p>
+    <w:p>
+      <w:pPr>
+        <w:pStyle w:val="BodyText"/>
+        <w:bidi w:val="0"/>
+        <w:jc w:val="start"/>
+        <w:rPr/>
+      </w:pPr>
+      <w:r>
+        <w:rPr/>
+        <w:t>Факт поставки от поставщика.</w:t>
       </w:r>
     </w:p>
     <w:p>
@@ -792,7 +1054,7 @@
         <w:rPr>
           <w:rStyle w:val="Strong"/>
         </w:rPr>
-        <w:t>Содержит:</w:t>
+        <w:t>Связи:</w:t>
       </w:r>
     </w:p>
     <w:p>
@@ -800,10 +1062,9 @@
         <w:pStyle w:val="BodyText"/>
         <w:numPr>
           <w:ilvl w:val="0"/>
-          <w:numId w:val="9"/>
+          <w:numId w:val="12"/>
         </w:numPr>
         <w:tabs>
-          <w:tab w:val="clear" w:pos="709"/>
           <w:tab w:val="left" w:pos="709" w:leader="none"/>
         </w:tabs>
         <w:bidi w:val="0"/>
@@ -813,8 +1074,14 @@
         <w:rPr/>
       </w:pPr>
       <w:r>
-        <w:rPr/>
-        <w:t xml:space="preserve">название, описание </w:t>
+        <w:rPr>
+          <w:rStyle w:val="SourceText"/>
+        </w:rPr>
+        <w:t>Поставка (N) → (1) Поставщик</w:t>
+      </w:r>
+      <w:r>
+        <w:rPr/>
+        <w:t xml:space="preserve"> </w:t>
       </w:r>
     </w:p>
     <w:p>
@@ -822,272 +1089,21 @@
         <w:pStyle w:val="BodyText"/>
         <w:numPr>
           <w:ilvl w:val="0"/>
-          <w:numId w:val="9"/>
+          <w:numId w:val="12"/>
         </w:numPr>
         <w:tabs>
-          <w:tab w:val="clear" w:pos="709"/>
           <w:tab w:val="left" w:pos="709" w:leader="none"/>
         </w:tabs>
         <w:bidi w:val="0"/>
-        <w:spacing w:before="0" w:after="0"/>
         <w:ind w:hanging="283" w:start="709"/>
         <w:jc w:val="start"/>
         <w:rPr/>
       </w:pPr>
       <w:r>
-        <w:rPr/>
-        <w:t xml:space="preserve">международное наименование (INN) </w:t>
-      </w:r>
-    </w:p>
-    <w:p>
-      <w:pPr>
-        <w:pStyle w:val="BodyText"/>
-        <w:numPr>
-          <w:ilvl w:val="0"/>
-          <w:numId w:val="9"/>
-        </w:numPr>
-        <w:tabs>
-          <w:tab w:val="clear" w:pos="709"/>
-          <w:tab w:val="left" w:pos="709" w:leader="none"/>
-        </w:tabs>
-        <w:bidi w:val="0"/>
-        <w:spacing w:before="0" w:after="0"/>
-        <w:ind w:hanging="283" w:start="709"/>
-        <w:jc w:val="start"/>
-        <w:rPr/>
-      </w:pPr>
-      <w:r>
-        <w:rPr/>
-        <w:t xml:space="preserve">дозировку </w:t>
-      </w:r>
-    </w:p>
-    <w:p>
-      <w:pPr>
-        <w:pStyle w:val="BodyText"/>
-        <w:numPr>
-          <w:ilvl w:val="0"/>
-          <w:numId w:val="9"/>
-        </w:numPr>
-        <w:tabs>
-          <w:tab w:val="clear" w:pos="709"/>
-          <w:tab w:val="left" w:pos="709" w:leader="none"/>
-        </w:tabs>
-        <w:bidi w:val="0"/>
-        <w:spacing w:before="0" w:after="0"/>
-        <w:ind w:hanging="283" w:start="709"/>
-        <w:jc w:val="start"/>
-        <w:rPr/>
-      </w:pPr>
-      <w:r>
-        <w:rPr/>
-        <w:t xml:space="preserve">производителя </w:t>
-      </w:r>
-    </w:p>
-    <w:p>
-      <w:pPr>
-        <w:pStyle w:val="BodyText"/>
-        <w:numPr>
-          <w:ilvl w:val="0"/>
-          <w:numId w:val="9"/>
-        </w:numPr>
-        <w:tabs>
-          <w:tab w:val="clear" w:pos="709"/>
-          <w:tab w:val="left" w:pos="709" w:leader="none"/>
-        </w:tabs>
-        <w:bidi w:val="0"/>
-        <w:ind w:hanging="283" w:start="709"/>
-        <w:jc w:val="start"/>
-        <w:rPr/>
-      </w:pPr>
-      <w:r>
-        <w:rPr/>
-        <w:t xml:space="preserve">тип препарата </w:t>
-      </w:r>
-    </w:p>
-    <w:p>
-      <w:pPr>
-        <w:pStyle w:val="BodyText"/>
-        <w:bidi w:val="0"/>
-        <w:jc w:val="start"/>
-        <w:rPr/>
-      </w:pPr>
-      <w:r>
-        <w:rPr>
-          <w:rStyle w:val="Strong"/>
-        </w:rPr>
-        <w:t>Связи:</w:t>
-      </w:r>
-    </w:p>
-    <w:p>
-      <w:pPr>
-        <w:pStyle w:val="BodyText"/>
-        <w:numPr>
-          <w:ilvl w:val="0"/>
-          <w:numId w:val="10"/>
-        </w:numPr>
-        <w:tabs>
-          <w:tab w:val="clear" w:pos="709"/>
-          <w:tab w:val="left" w:pos="709" w:leader="none"/>
-        </w:tabs>
-        <w:bidi w:val="0"/>
-        <w:spacing w:before="0" w:after="0"/>
-        <w:ind w:hanging="283" w:start="709"/>
-        <w:jc w:val="start"/>
-        <w:rPr/>
-      </w:pPr>
-      <w:r>
         <w:rPr>
           <w:rStyle w:val="SourceText"/>
         </w:rPr>
-        <w:t xml:space="preserve">Препарат </w:t>
-      </w:r>
-      <w:r>
-        <w:rPr>
-          <w:rStyle w:val="SourceText"/>
-        </w:rPr>
-        <w:t xml:space="preserve">(N) → (1) </w:t>
-      </w:r>
-      <w:r>
-        <w:rPr>
-          <w:rStyle w:val="SourceText"/>
-        </w:rPr>
-        <w:t>Тип_Лекарства</w:t>
-      </w:r>
-      <w:r>
-        <w:rPr/>
-        <w:t xml:space="preserve"> </w:t>
-      </w:r>
-    </w:p>
-    <w:p>
-      <w:pPr>
-        <w:pStyle w:val="BodyText"/>
-        <w:numPr>
-          <w:ilvl w:val="0"/>
-          <w:numId w:val="10"/>
-        </w:numPr>
-        <w:tabs>
-          <w:tab w:val="clear" w:pos="709"/>
-          <w:tab w:val="left" w:pos="709" w:leader="none"/>
-        </w:tabs>
-        <w:bidi w:val="0"/>
-        <w:spacing w:before="0" w:after="0"/>
-        <w:ind w:hanging="283" w:start="709"/>
-        <w:jc w:val="start"/>
-        <w:rPr/>
-      </w:pPr>
-      <w:r>
-        <w:rPr>
-          <w:rStyle w:val="SourceText"/>
-        </w:rPr>
-        <w:t xml:space="preserve">Препарат </w:t>
-      </w:r>
-      <w:r>
-        <w:rPr>
-          <w:rStyle w:val="SourceText"/>
-        </w:rPr>
-        <w:t xml:space="preserve">(N) → (1) </w:t>
-      </w:r>
-      <w:r>
-        <w:rPr>
-          <w:rStyle w:val="SourceText"/>
-        </w:rPr>
-        <w:t>Производитель</w:t>
-      </w:r>
-      <w:r>
-        <w:rPr/>
-        <w:t xml:space="preserve"> </w:t>
-      </w:r>
-    </w:p>
-    <w:p>
-      <w:pPr>
-        <w:pStyle w:val="BodyText"/>
-        <w:numPr>
-          <w:ilvl w:val="0"/>
-          <w:numId w:val="10"/>
-        </w:numPr>
-        <w:tabs>
-          <w:tab w:val="clear" w:pos="709"/>
-          <w:tab w:val="left" w:pos="709" w:leader="none"/>
-        </w:tabs>
-        <w:bidi w:val="0"/>
-        <w:spacing w:before="0" w:after="0"/>
-        <w:ind w:hanging="283" w:start="709"/>
-        <w:jc w:val="start"/>
-        <w:rPr/>
-      </w:pPr>
-      <w:r>
-        <w:rPr>
-          <w:rStyle w:val="SourceText"/>
-        </w:rPr>
-        <w:t xml:space="preserve">Препарат </w:t>
-      </w:r>
-      <w:r>
-        <w:rPr>
-          <w:rStyle w:val="SourceText"/>
-        </w:rPr>
-        <w:t xml:space="preserve">(1) → (N) </w:t>
-      </w:r>
-      <w:r>
-        <w:rPr>
-          <w:rStyle w:val="SourceText"/>
-        </w:rPr>
-        <w:t>Партия</w:t>
-      </w:r>
-      <w:r>
-        <w:rPr/>
-        <w:t xml:space="preserve"> </w:t>
-      </w:r>
-    </w:p>
-    <w:p>
-      <w:pPr>
-        <w:pStyle w:val="BodyText"/>
-        <w:numPr>
-          <w:ilvl w:val="0"/>
-          <w:numId w:val="10"/>
-        </w:numPr>
-        <w:tabs>
-          <w:tab w:val="clear" w:pos="709"/>
-          <w:tab w:val="left" w:pos="709" w:leader="none"/>
-        </w:tabs>
-        <w:bidi w:val="0"/>
-        <w:ind w:hanging="283" w:start="709"/>
-        <w:jc w:val="start"/>
-        <w:rPr/>
-      </w:pPr>
-      <w:r>
-        <w:rPr>
-          <w:rStyle w:val="SourceText"/>
-        </w:rPr>
-        <w:t>Препарат</w:t>
-      </w:r>
-      <w:r>
-        <w:rPr>
-          <w:rStyle w:val="SourceText"/>
-        </w:rPr>
-        <w:t xml:space="preserve"> (1) → (N) </w:t>
-      </w:r>
-      <w:r>
-        <w:rPr>
-          <w:rStyle w:val="SourceText"/>
-        </w:rPr>
-        <w:t>Элемент_Корзины</w:t>
-      </w:r>
-      <w:r>
-        <w:rPr/>
-        <w:t xml:space="preserve"> </w:t>
-      </w:r>
-    </w:p>
-    <w:p>
-      <w:pPr>
-        <w:pStyle w:val="Heading1"/>
-        <w:bidi w:val="0"/>
-        <w:spacing w:lineRule="auto" w:line="276" w:before="0" w:after="140"/>
-        <w:jc w:val="start"/>
-        <w:rPr/>
-      </w:pPr>
-      <w:r>
-        <w:rPr/>
-        <w:t>3. Поставки и склад</w:t>
+        <w:t>Поставка (1) → (N) Партия</w:t>
       </w:r>
     </w:p>
     <w:p>
@@ -1106,19 +1122,19 @@
           <w:i/>
           <w:iCs/>
         </w:rPr>
-        <w:t>3.1. Поставщик</w:t>
-      </w:r>
-    </w:p>
-    <w:p>
-      <w:pPr>
-        <w:pStyle w:val="BodyText"/>
-        <w:bidi w:val="0"/>
-        <w:jc w:val="start"/>
-        <w:rPr/>
-      </w:pPr>
-      <w:r>
-        <w:rPr/>
-        <w:t>Поставщики товаров.</w:t>
+        <w:t>3.4. Партия</w:t>
+      </w:r>
+    </w:p>
+    <w:p>
+      <w:pPr>
+        <w:pStyle w:val="BodyText"/>
+        <w:bidi w:val="0"/>
+        <w:jc w:val="start"/>
+        <w:rPr/>
+      </w:pPr>
+      <w:r>
+        <w:rPr/>
+        <w:t>Партия товара (конкретная поставка препарата).</w:t>
       </w:r>
     </w:p>
     <w:p>
@@ -1132,7 +1148,7 @@
         <w:rPr>
           <w:rStyle w:val="Strong"/>
         </w:rPr>
-        <w:t>Связи:</w:t>
+        <w:t>Содержит:</w:t>
       </w:r>
     </w:p>
     <w:p>
@@ -1140,34 +1156,201 @@
         <w:pStyle w:val="BodyText"/>
         <w:numPr>
           <w:ilvl w:val="0"/>
-          <w:numId w:val="11"/>
+          <w:numId w:val="13"/>
         </w:numPr>
         <w:tabs>
-          <w:tab w:val="clear" w:pos="709"/>
           <w:tab w:val="left" w:pos="709" w:leader="none"/>
         </w:tabs>
         <w:bidi w:val="0"/>
+        <w:spacing w:before="0" w:after="0"/>
         <w:ind w:hanging="283" w:start="709"/>
         <w:jc w:val="start"/>
         <w:rPr/>
       </w:pPr>
       <w:r>
+        <w:rPr/>
+        <w:t xml:space="preserve">срок годности </w:t>
+      </w:r>
+    </w:p>
+    <w:p>
+      <w:pPr>
+        <w:pStyle w:val="BodyText"/>
+        <w:numPr>
+          <w:ilvl w:val="0"/>
+          <w:numId w:val="13"/>
+        </w:numPr>
+        <w:tabs>
+          <w:tab w:val="left" w:pos="709" w:leader="none"/>
+        </w:tabs>
+        <w:bidi w:val="0"/>
+        <w:spacing w:before="0" w:after="0"/>
+        <w:ind w:hanging="283" w:start="709"/>
+        <w:jc w:val="start"/>
+        <w:rPr/>
+      </w:pPr>
+      <w:r>
+        <w:rPr/>
+        <w:t xml:space="preserve">дату поступления </w:t>
+      </w:r>
+    </w:p>
+    <w:p>
+      <w:pPr>
+        <w:pStyle w:val="BodyText"/>
+        <w:numPr>
+          <w:ilvl w:val="0"/>
+          <w:numId w:val="13"/>
+        </w:numPr>
+        <w:tabs>
+          <w:tab w:val="left" w:pos="709" w:leader="none"/>
+        </w:tabs>
+        <w:bidi w:val="0"/>
+        <w:ind w:hanging="283" w:start="709"/>
+        <w:jc w:val="start"/>
+        <w:rPr/>
+      </w:pPr>
+      <w:r>
+        <w:rPr/>
+        <w:t xml:space="preserve">цену закупки </w:t>
+      </w:r>
+    </w:p>
+    <w:p>
+      <w:pPr>
+        <w:pStyle w:val="BodyText"/>
+        <w:bidi w:val="0"/>
+        <w:jc w:val="start"/>
+        <w:rPr/>
+      </w:pPr>
+      <w:r>
+        <w:rPr>
+          <w:rStyle w:val="Strong"/>
+        </w:rPr>
+        <w:t>Связи:</w:t>
+      </w:r>
+    </w:p>
+    <w:p>
+      <w:pPr>
+        <w:pStyle w:val="BodyText"/>
+        <w:numPr>
+          <w:ilvl w:val="0"/>
+          <w:numId w:val="14"/>
+        </w:numPr>
+        <w:tabs>
+          <w:tab w:val="left" w:pos="709" w:leader="none"/>
+        </w:tabs>
+        <w:bidi w:val="0"/>
+        <w:spacing w:before="0" w:after="0"/>
+        <w:ind w:hanging="283" w:start="709"/>
+        <w:jc w:val="start"/>
+        <w:rPr/>
+      </w:pPr>
+      <w:r>
         <w:rPr>
           <w:rStyle w:val="SourceText"/>
         </w:rPr>
-        <w:t>Поставщик</w:t>
-      </w:r>
+        <w:t>Партия (N) → (1) Препарат</w:t>
+      </w:r>
+    </w:p>
+    <w:p>
+      <w:pPr>
+        <w:pStyle w:val="BodyText"/>
+        <w:numPr>
+          <w:ilvl w:val="0"/>
+          <w:numId w:val="14"/>
+        </w:numPr>
+        <w:tabs>
+          <w:tab w:val="left" w:pos="709" w:leader="none"/>
+        </w:tabs>
+        <w:bidi w:val="0"/>
+        <w:spacing w:before="0" w:after="0"/>
+        <w:ind w:hanging="283" w:start="709"/>
+        <w:jc w:val="start"/>
+        <w:rPr/>
+      </w:pPr>
       <w:r>
         <w:rPr>
           <w:rStyle w:val="SourceText"/>
         </w:rPr>
-        <w:t xml:space="preserve"> (1) → (N) </w:t>
-      </w:r>
+        <w:t>Партия (N) → (1) Поставка</w:t>
+      </w:r>
+      <w:r>
+        <w:rPr/>
+        <w:t xml:space="preserve"> </w:t>
+      </w:r>
+    </w:p>
+    <w:p>
+      <w:pPr>
+        <w:pStyle w:val="BodyText"/>
+        <w:numPr>
+          <w:ilvl w:val="0"/>
+          <w:numId w:val="14"/>
+        </w:numPr>
+        <w:tabs>
+          <w:tab w:val="left" w:pos="709" w:leader="none"/>
+        </w:tabs>
+        <w:bidi w:val="0"/>
+        <w:spacing w:before="0" w:after="0"/>
+        <w:ind w:hanging="283" w:start="709"/>
+        <w:jc w:val="start"/>
+        <w:rPr/>
+      </w:pPr>
       <w:r>
         <w:rPr>
           <w:rStyle w:val="SourceText"/>
         </w:rPr>
-        <w:t>Поставка</w:t>
+        <w:t>Партия (1) → (N) Запасы</w:t>
+      </w:r>
+      <w:r>
+        <w:rPr/>
+        <w:t xml:space="preserve"> </w:t>
+      </w:r>
+    </w:p>
+    <w:p>
+      <w:pPr>
+        <w:pStyle w:val="BodyText"/>
+        <w:numPr>
+          <w:ilvl w:val="0"/>
+          <w:numId w:val="14"/>
+        </w:numPr>
+        <w:tabs>
+          <w:tab w:val="left" w:pos="709" w:leader="none"/>
+        </w:tabs>
+        <w:bidi w:val="0"/>
+        <w:spacing w:before="0" w:after="0"/>
+        <w:ind w:hanging="283" w:start="709"/>
+        <w:jc w:val="start"/>
+        <w:rPr/>
+      </w:pPr>
+      <w:r>
+        <w:rPr>
+          <w:rStyle w:val="SourceText"/>
+        </w:rPr>
+        <w:t>Партия (1) → (N) Элемент_Заказа</w:t>
+      </w:r>
+    </w:p>
+    <w:p>
+      <w:pPr>
+        <w:pStyle w:val="BodyText"/>
+        <w:numPr>
+          <w:ilvl w:val="0"/>
+          <w:numId w:val="14"/>
+        </w:numPr>
+        <w:tabs>
+          <w:tab w:val="left" w:pos="709" w:leader="none"/>
+        </w:tabs>
+        <w:bidi w:val="0"/>
+        <w:ind w:hanging="283" w:start="709"/>
+        <w:jc w:val="start"/>
+        <w:rPr/>
+      </w:pPr>
+      <w:r>
+        <w:rPr>
+          <w:rStyle w:val="SourceText"/>
+        </w:rPr>
+        <w:t>Партия (1) → (N) Резервация</w:t>
+      </w:r>
+      <w:r>
+        <w:rPr/>
+        <w:t xml:space="preserve"> </w:t>
       </w:r>
     </w:p>
     <w:p>
@@ -1186,19 +1369,19 @@
           <w:i/>
           <w:iCs/>
         </w:rPr>
-        <w:t>3.2. Поставка</w:t>
-      </w:r>
-    </w:p>
-    <w:p>
-      <w:pPr>
-        <w:pStyle w:val="BodyText"/>
-        <w:bidi w:val="0"/>
-        <w:jc w:val="start"/>
-        <w:rPr/>
-      </w:pPr>
-      <w:r>
-        <w:rPr/>
-        <w:t>Факт поставки от поставщика.</w:t>
+        <w:t>3.5. Склад</w:t>
+      </w:r>
+    </w:p>
+    <w:p>
+      <w:pPr>
+        <w:pStyle w:val="BodyText"/>
+        <w:bidi w:val="0"/>
+        <w:jc w:val="start"/>
+        <w:rPr/>
+      </w:pPr>
+      <w:r>
+        <w:rPr/>
+        <w:t>Справочник складов.</w:t>
       </w:r>
     </w:p>
     <w:p>
@@ -1220,14 +1403,12 @@
         <w:pStyle w:val="BodyText"/>
         <w:numPr>
           <w:ilvl w:val="0"/>
-          <w:numId w:val="12"/>
+          <w:numId w:val="15"/>
         </w:numPr>
         <w:tabs>
-          <w:tab w:val="clear" w:pos="709"/>
           <w:tab w:val="left" w:pos="709" w:leader="none"/>
         </w:tabs>
         <w:bidi w:val="0"/>
-        <w:spacing w:before="0" w:after="0"/>
         <w:ind w:hanging="283" w:start="709"/>
         <w:jc w:val="start"/>
         <w:rPr/>
@@ -1236,58 +1417,7 @@
         <w:rPr>
           <w:rStyle w:val="SourceText"/>
         </w:rPr>
-        <w:t xml:space="preserve">Поставка </w:t>
-      </w:r>
-      <w:r>
-        <w:rPr>
-          <w:rStyle w:val="SourceText"/>
-        </w:rPr>
-        <w:t xml:space="preserve">(N) → (1) </w:t>
-      </w:r>
-      <w:r>
-        <w:rPr>
-          <w:rStyle w:val="SourceText"/>
-        </w:rPr>
-        <w:t>Поставщик</w:t>
-      </w:r>
-      <w:r>
-        <w:rPr/>
-        <w:t xml:space="preserve"> </w:t>
-      </w:r>
-    </w:p>
-    <w:p>
-      <w:pPr>
-        <w:pStyle w:val="BodyText"/>
-        <w:numPr>
-          <w:ilvl w:val="0"/>
-          <w:numId w:val="12"/>
-        </w:numPr>
-        <w:tabs>
-          <w:tab w:val="clear" w:pos="709"/>
-          <w:tab w:val="left" w:pos="709" w:leader="none"/>
-        </w:tabs>
-        <w:bidi w:val="0"/>
-        <w:ind w:hanging="283" w:start="709"/>
-        <w:jc w:val="start"/>
-        <w:rPr/>
-      </w:pPr>
-      <w:r>
-        <w:rPr>
-          <w:rStyle w:val="SourceText"/>
-        </w:rPr>
-        <w:t xml:space="preserve">Поставка </w:t>
-      </w:r>
-      <w:r>
-        <w:rPr>
-          <w:rStyle w:val="SourceText"/>
-        </w:rPr>
-        <w:t xml:space="preserve">(1) → (N) </w:t>
-      </w:r>
-      <w:r>
-        <w:rPr>
-          <w:rStyle w:val="SourceText"/>
-        </w:rPr>
-        <w:t>Партия</w:t>
+        <w:t>Склад (1) → (N) Запасы</w:t>
       </w:r>
     </w:p>
     <w:p>
@@ -1306,19 +1436,19 @@
           <w:i/>
           <w:iCs/>
         </w:rPr>
-        <w:t>3.4. Партия</w:t>
-      </w:r>
-    </w:p>
-    <w:p>
-      <w:pPr>
-        <w:pStyle w:val="BodyText"/>
-        <w:bidi w:val="0"/>
-        <w:jc w:val="start"/>
-        <w:rPr/>
-      </w:pPr>
-      <w:r>
-        <w:rPr/>
-        <w:t>Партия товара (конкретная поставка препарата).</w:t>
+        <w:t>3.6. Запасы</w:t>
+      </w:r>
+    </w:p>
+    <w:p>
+      <w:pPr>
+        <w:pStyle w:val="BodyText"/>
+        <w:bidi w:val="0"/>
+        <w:jc w:val="start"/>
+        <w:rPr/>
+      </w:pPr>
+      <w:r>
+        <w:rPr/>
+        <w:t>Остатки товара на складе.</w:t>
       </w:r>
     </w:p>
     <w:p>
@@ -1340,10 +1470,43 @@
         <w:pStyle w:val="BodyText"/>
         <w:numPr>
           <w:ilvl w:val="0"/>
-          <w:numId w:val="13"/>
+          <w:numId w:val="16"/>
         </w:numPr>
         <w:tabs>
-          <w:tab w:val="clear" w:pos="709"/>
+          <w:tab w:val="left" w:pos="709" w:leader="none"/>
+        </w:tabs>
+        <w:bidi w:val="0"/>
+        <w:ind w:hanging="283" w:start="709"/>
+        <w:jc w:val="start"/>
+        <w:rPr/>
+      </w:pPr>
+      <w:r>
+        <w:rPr/>
+        <w:t xml:space="preserve">количество конкретной партии на складе </w:t>
+      </w:r>
+    </w:p>
+    <w:p>
+      <w:pPr>
+        <w:pStyle w:val="BodyText"/>
+        <w:bidi w:val="0"/>
+        <w:jc w:val="start"/>
+        <w:rPr/>
+      </w:pPr>
+      <w:r>
+        <w:rPr>
+          <w:rStyle w:val="Strong"/>
+        </w:rPr>
+        <w:t>Связи:</w:t>
+      </w:r>
+    </w:p>
+    <w:p>
+      <w:pPr>
+        <w:pStyle w:val="BodyText"/>
+        <w:numPr>
+          <w:ilvl w:val="0"/>
+          <w:numId w:val="17"/>
+        </w:numPr>
+        <w:tabs>
           <w:tab w:val="left" w:pos="709" w:leader="none"/>
         </w:tabs>
         <w:bidi w:val="0"/>
@@ -1353,8 +1516,10 @@
         <w:rPr/>
       </w:pPr>
       <w:r>
-        <w:rPr/>
-        <w:t xml:space="preserve">срок годности </w:t>
+        <w:rPr>
+          <w:rStyle w:val="SourceText"/>
+        </w:rPr>
+        <w:t>Запасы (N) → (1) Склад</w:t>
       </w:r>
     </w:p>
     <w:p>
@@ -1362,128 +1527,21 @@
         <w:pStyle w:val="BodyText"/>
         <w:numPr>
           <w:ilvl w:val="0"/>
-          <w:numId w:val="13"/>
+          <w:numId w:val="17"/>
         </w:numPr>
         <w:tabs>
-          <w:tab w:val="clear" w:pos="709"/>
           <w:tab w:val="left" w:pos="709" w:leader="none"/>
         </w:tabs>
         <w:bidi w:val="0"/>
-        <w:spacing w:before="0" w:after="0"/>
         <w:ind w:hanging="283" w:start="709"/>
         <w:jc w:val="start"/>
         <w:rPr/>
       </w:pPr>
       <w:r>
-        <w:rPr/>
-        <w:t xml:space="preserve">дату поступления </w:t>
-      </w:r>
-    </w:p>
-    <w:p>
-      <w:pPr>
-        <w:pStyle w:val="BodyText"/>
-        <w:numPr>
-          <w:ilvl w:val="0"/>
-          <w:numId w:val="13"/>
-        </w:numPr>
-        <w:tabs>
-          <w:tab w:val="clear" w:pos="709"/>
-          <w:tab w:val="left" w:pos="709" w:leader="none"/>
-        </w:tabs>
-        <w:bidi w:val="0"/>
-        <w:ind w:hanging="283" w:start="709"/>
-        <w:jc w:val="start"/>
-        <w:rPr/>
-      </w:pPr>
-      <w:r>
-        <w:rPr/>
-        <w:t xml:space="preserve">цену закупки </w:t>
-      </w:r>
-    </w:p>
-    <w:p>
-      <w:pPr>
-        <w:pStyle w:val="BodyText"/>
-        <w:bidi w:val="0"/>
-        <w:jc w:val="start"/>
-        <w:rPr/>
-      </w:pPr>
-      <w:r>
-        <w:rPr>
-          <w:rStyle w:val="Strong"/>
-        </w:rPr>
-        <w:t>Связи:</w:t>
-      </w:r>
-    </w:p>
-    <w:p>
-      <w:pPr>
-        <w:pStyle w:val="BodyText"/>
-        <w:numPr>
-          <w:ilvl w:val="0"/>
-          <w:numId w:val="14"/>
-        </w:numPr>
-        <w:tabs>
-          <w:tab w:val="clear" w:pos="709"/>
-          <w:tab w:val="left" w:pos="709" w:leader="none"/>
-        </w:tabs>
-        <w:bidi w:val="0"/>
-        <w:spacing w:before="0" w:after="0"/>
-        <w:ind w:hanging="283" w:start="709"/>
-        <w:jc w:val="start"/>
-        <w:rPr/>
-      </w:pPr>
-      <w:r>
         <w:rPr>
           <w:rStyle w:val="SourceText"/>
         </w:rPr>
-        <w:t>Партия</w:t>
-      </w:r>
-      <w:r>
-        <w:rPr>
-          <w:rStyle w:val="SourceText"/>
-        </w:rPr>
-        <w:t xml:space="preserve"> (N) → (1) </w:t>
-      </w:r>
-      <w:r>
-        <w:rPr>
-          <w:rStyle w:val="SourceText"/>
-        </w:rPr>
-        <w:t>Препарат</w:t>
-      </w:r>
-    </w:p>
-    <w:p>
-      <w:pPr>
-        <w:pStyle w:val="BodyText"/>
-        <w:numPr>
-          <w:ilvl w:val="0"/>
-          <w:numId w:val="14"/>
-        </w:numPr>
-        <w:tabs>
-          <w:tab w:val="clear" w:pos="709"/>
-          <w:tab w:val="left" w:pos="709" w:leader="none"/>
-        </w:tabs>
-        <w:bidi w:val="0"/>
-        <w:spacing w:before="0" w:after="0"/>
-        <w:ind w:hanging="283" w:start="709"/>
-        <w:jc w:val="start"/>
-        <w:rPr/>
-      </w:pPr>
-      <w:r>
-        <w:rPr>
-          <w:rStyle w:val="SourceText"/>
-        </w:rPr>
-        <w:t>Партия</w:t>
-      </w:r>
-      <w:r>
-        <w:rPr>
-          <w:rStyle w:val="SourceText"/>
-        </w:rPr>
-        <w:t xml:space="preserve"> (N) → (1) </w:t>
-      </w:r>
-      <w:r>
-        <w:rPr>
-          <w:rStyle w:val="SourceText"/>
-        </w:rPr>
-        <w:t>Поставка</w:t>
+        <w:t>Запасы (N) → (1) Партия</w:t>
       </w:r>
       <w:r>
         <w:rPr/>
@@ -1492,117 +1550,15 @@
     </w:p>
     <w:p>
       <w:pPr>
-        <w:pStyle w:val="BodyText"/>
-        <w:numPr>
-          <w:ilvl w:val="0"/>
-          <w:numId w:val="14"/>
-        </w:numPr>
-        <w:tabs>
-          <w:tab w:val="clear" w:pos="709"/>
-          <w:tab w:val="left" w:pos="709" w:leader="none"/>
-        </w:tabs>
-        <w:bidi w:val="0"/>
-        <w:spacing w:before="0" w:after="0"/>
-        <w:ind w:hanging="283" w:start="709"/>
-        <w:jc w:val="start"/>
-        <w:rPr/>
-      </w:pPr>
-      <w:r>
-        <w:rPr>
-          <w:rStyle w:val="SourceText"/>
-        </w:rPr>
-        <w:t>Партия</w:t>
-      </w:r>
-      <w:r>
-        <w:rPr>
-          <w:rStyle w:val="SourceText"/>
-        </w:rPr>
-        <w:t xml:space="preserve"> (1) → (N) </w:t>
-      </w:r>
-      <w:r>
-        <w:rPr>
-          <w:rStyle w:val="SourceText"/>
-        </w:rPr>
-        <w:t>Запасы</w:t>
-      </w:r>
-      <w:r>
-        <w:rPr/>
-        <w:t xml:space="preserve"> </w:t>
-      </w:r>
-    </w:p>
-    <w:p>
-      <w:pPr>
-        <w:pStyle w:val="BodyText"/>
-        <w:numPr>
-          <w:ilvl w:val="0"/>
-          <w:numId w:val="14"/>
-        </w:numPr>
-        <w:tabs>
-          <w:tab w:val="clear" w:pos="709"/>
-          <w:tab w:val="left" w:pos="709" w:leader="none"/>
-        </w:tabs>
-        <w:bidi w:val="0"/>
-        <w:spacing w:before="0" w:after="0"/>
-        <w:ind w:hanging="283" w:start="709"/>
-        <w:jc w:val="start"/>
-        <w:rPr/>
-      </w:pPr>
-      <w:r>
-        <w:rPr>
-          <w:rStyle w:val="SourceText"/>
-        </w:rPr>
-        <w:t>Партия</w:t>
-      </w:r>
-      <w:r>
-        <w:rPr>
-          <w:rStyle w:val="SourceText"/>
-        </w:rPr>
-        <w:t xml:space="preserve"> (1) → (N) </w:t>
-      </w:r>
-      <w:r>
-        <w:rPr>
-          <w:rStyle w:val="SourceText"/>
-        </w:rPr>
-        <w:t>Элемент_Заказа</w:t>
-      </w:r>
-    </w:p>
-    <w:p>
-      <w:pPr>
-        <w:pStyle w:val="BodyText"/>
-        <w:numPr>
-          <w:ilvl w:val="0"/>
-          <w:numId w:val="14"/>
-        </w:numPr>
-        <w:tabs>
-          <w:tab w:val="clear" w:pos="709"/>
-          <w:tab w:val="left" w:pos="709" w:leader="none"/>
-        </w:tabs>
-        <w:bidi w:val="0"/>
-        <w:ind w:hanging="283" w:start="709"/>
-        <w:jc w:val="start"/>
-        <w:rPr/>
-      </w:pPr>
-      <w:r>
-        <w:rPr>
-          <w:rStyle w:val="SourceText"/>
-        </w:rPr>
-        <w:t>Партия</w:t>
-      </w:r>
-      <w:r>
-        <w:rPr>
-          <w:rStyle w:val="SourceText"/>
-        </w:rPr>
-        <w:t xml:space="preserve"> (1) → (N) </w:t>
-      </w:r>
-      <w:r>
-        <w:rPr>
-          <w:rStyle w:val="SourceText"/>
-        </w:rPr>
-        <w:t>Резервация</w:t>
-      </w:r>
-      <w:r>
-        <w:rPr/>
-        <w:t xml:space="preserve"> </w:t>
+        <w:pStyle w:val="Heading1"/>
+        <w:bidi w:val="0"/>
+        <w:spacing w:lineRule="auto" w:line="276" w:before="0" w:after="140"/>
+        <w:jc w:val="start"/>
+        <w:rPr/>
+      </w:pPr>
+      <w:r>
+        <w:rPr/>
+        <w:t>4. Корзина и заказы</w:t>
       </w:r>
     </w:p>
     <w:p>
@@ -1621,19 +1577,19 @@
           <w:i/>
           <w:iCs/>
         </w:rPr>
-        <w:t>3.5. Склад</w:t>
-      </w:r>
-    </w:p>
-    <w:p>
-      <w:pPr>
-        <w:pStyle w:val="BodyText"/>
-        <w:bidi w:val="0"/>
-        <w:jc w:val="start"/>
-        <w:rPr/>
-      </w:pPr>
-      <w:r>
-        <w:rPr/>
-        <w:t>Справочник складов.</w:t>
+        <w:t>4.1. Корзина</w:t>
+      </w:r>
+    </w:p>
+    <w:p>
+      <w:pPr>
+        <w:pStyle w:val="BodyText"/>
+        <w:bidi w:val="0"/>
+        <w:jc w:val="start"/>
+        <w:rPr/>
+      </w:pPr>
+      <w:r>
+        <w:rPr/>
+        <w:t>Корзина пользователя.</w:t>
       </w:r>
     </w:p>
     <w:p>
@@ -1647,7 +1603,7 @@
         <w:rPr>
           <w:rStyle w:val="Strong"/>
         </w:rPr>
-        <w:t>Связи:</w:t>
+        <w:t>Содержит:</w:t>
       </w:r>
     </w:p>
     <w:p>
@@ -1655,34 +1611,103 @@
         <w:pStyle w:val="BodyText"/>
         <w:numPr>
           <w:ilvl w:val="0"/>
-          <w:numId w:val="15"/>
+          <w:numId w:val="18"/>
         </w:numPr>
         <w:tabs>
-          <w:tab w:val="clear" w:pos="709"/>
           <w:tab w:val="left" w:pos="709" w:leader="none"/>
         </w:tabs>
         <w:bidi w:val="0"/>
+        <w:spacing w:before="0" w:after="0"/>
         <w:ind w:hanging="283" w:start="709"/>
         <w:jc w:val="start"/>
         <w:rPr/>
       </w:pPr>
       <w:r>
+        <w:rPr/>
+        <w:t xml:space="preserve">статус (активная, оформлена и т.п.) </w:t>
+      </w:r>
+    </w:p>
+    <w:p>
+      <w:pPr>
+        <w:pStyle w:val="BodyText"/>
+        <w:numPr>
+          <w:ilvl w:val="0"/>
+          <w:numId w:val="18"/>
+        </w:numPr>
+        <w:tabs>
+          <w:tab w:val="left" w:pos="709" w:leader="none"/>
+        </w:tabs>
+        <w:bidi w:val="0"/>
+        <w:ind w:hanging="283" w:start="709"/>
+        <w:jc w:val="start"/>
+        <w:rPr/>
+      </w:pPr>
+      <w:r>
+        <w:rPr/>
+        <w:t xml:space="preserve">даты создания/обновления </w:t>
+      </w:r>
+    </w:p>
+    <w:p>
+      <w:pPr>
+        <w:pStyle w:val="BodyText"/>
+        <w:bidi w:val="0"/>
+        <w:jc w:val="start"/>
+        <w:rPr/>
+      </w:pPr>
+      <w:r>
+        <w:rPr>
+          <w:rStyle w:val="Strong"/>
+        </w:rPr>
+        <w:t>Связи:</w:t>
+      </w:r>
+    </w:p>
+    <w:p>
+      <w:pPr>
+        <w:pStyle w:val="BodyText"/>
+        <w:numPr>
+          <w:ilvl w:val="0"/>
+          <w:numId w:val="19"/>
+        </w:numPr>
+        <w:tabs>
+          <w:tab w:val="left" w:pos="709" w:leader="none"/>
+        </w:tabs>
+        <w:bidi w:val="0"/>
+        <w:spacing w:before="0" w:after="0"/>
+        <w:ind w:hanging="283" w:start="709"/>
+        <w:jc w:val="start"/>
+        <w:rPr/>
+      </w:pPr>
+      <w:r>
         <w:rPr>
           <w:rStyle w:val="SourceText"/>
         </w:rPr>
-        <w:t>Склад</w:t>
-      </w:r>
+        <w:t>Корзина (N) → (1) Пользователь</w:t>
+      </w:r>
+    </w:p>
+    <w:p>
+      <w:pPr>
+        <w:pStyle w:val="BodyText"/>
+        <w:numPr>
+          <w:ilvl w:val="0"/>
+          <w:numId w:val="19"/>
+        </w:numPr>
+        <w:tabs>
+          <w:tab w:val="left" w:pos="709" w:leader="none"/>
+        </w:tabs>
+        <w:bidi w:val="0"/>
+        <w:ind w:hanging="283" w:start="709"/>
+        <w:jc w:val="start"/>
+        <w:rPr/>
+      </w:pPr>
       <w:r>
         <w:rPr>
           <w:rStyle w:val="SourceText"/>
         </w:rPr>
-        <w:t xml:space="preserve"> (1) → (N) </w:t>
-      </w:r>
-      <w:r>
-        <w:rPr>
-          <w:rStyle w:val="SourceText"/>
-        </w:rPr>
-        <w:t>Запасы</w:t>
+        <w:t>Корзина (1) → (N) Элемент_Корзины</w:t>
+      </w:r>
+      <w:r>
+        <w:rPr/>
+        <w:t xml:space="preserve"> </w:t>
       </w:r>
     </w:p>
     <w:p>
@@ -1701,19 +1726,19 @@
           <w:i/>
           <w:iCs/>
         </w:rPr>
-        <w:t>3.6. Запасы</w:t>
-      </w:r>
-    </w:p>
-    <w:p>
-      <w:pPr>
-        <w:pStyle w:val="BodyText"/>
-        <w:bidi w:val="0"/>
-        <w:jc w:val="start"/>
-        <w:rPr/>
-      </w:pPr>
-      <w:r>
-        <w:rPr/>
-        <w:t>Остатки товара на складе.</w:t>
+        <w:t>4.2. Элемент_Корзины</w:t>
+      </w:r>
+    </w:p>
+    <w:p>
+      <w:pPr>
+        <w:pStyle w:val="BodyText"/>
+        <w:bidi w:val="0"/>
+        <w:jc w:val="start"/>
+        <w:rPr/>
+      </w:pPr>
+      <w:r>
+        <w:rPr/>
+        <w:t>Позиции в корзине.</w:t>
       </w:r>
     </w:p>
     <w:p>
@@ -1727,7 +1752,7 @@
         <w:rPr>
           <w:rStyle w:val="Strong"/>
         </w:rPr>
-        <w:t>Содержит:</w:t>
+        <w:t>Связи:</w:t>
       </w:r>
     </w:p>
     <w:p>
@@ -1735,34 +1760,26 @@
         <w:pStyle w:val="BodyText"/>
         <w:numPr>
           <w:ilvl w:val="0"/>
-          <w:numId w:val="16"/>
+          <w:numId w:val="20"/>
         </w:numPr>
         <w:tabs>
-          <w:tab w:val="clear" w:pos="709"/>
           <w:tab w:val="left" w:pos="709" w:leader="none"/>
         </w:tabs>
         <w:bidi w:val="0"/>
+        <w:spacing w:before="0" w:after="0"/>
         <w:ind w:hanging="283" w:start="709"/>
         <w:jc w:val="start"/>
         <w:rPr/>
       </w:pPr>
       <w:r>
-        <w:rPr/>
-        <w:t xml:space="preserve">количество конкретной партии на складе </w:t>
-      </w:r>
-    </w:p>
-    <w:p>
-      <w:pPr>
-        <w:pStyle w:val="BodyText"/>
-        <w:bidi w:val="0"/>
-        <w:jc w:val="start"/>
-        <w:rPr/>
-      </w:pPr>
-      <w:r>
-        <w:rPr>
-          <w:rStyle w:val="Strong"/>
-        </w:rPr>
-        <w:t>Связи:</w:t>
+        <w:rPr>
+          <w:rStyle w:val="SourceText"/>
+        </w:rPr>
+        <w:t>Элемент_Корзины (N) → (1) Корзина</w:t>
+      </w:r>
+      <w:r>
+        <w:rPr/>
+        <w:t xml:space="preserve"> </w:t>
       </w:r>
     </w:p>
     <w:p>
@@ -1770,14 +1787,12 @@
         <w:pStyle w:val="BodyText"/>
         <w:numPr>
           <w:ilvl w:val="0"/>
-          <w:numId w:val="17"/>
+          <w:numId w:val="20"/>
         </w:numPr>
         <w:tabs>
-          <w:tab w:val="clear" w:pos="709"/>
           <w:tab w:val="left" w:pos="709" w:leader="none"/>
         </w:tabs>
         <w:bidi w:val="0"/>
-        <w:spacing w:before="0" w:after="0"/>
         <w:ind w:hanging="283" w:start="709"/>
         <w:jc w:val="start"/>
         <w:rPr/>
@@ -1786,71 +1801,11 @@
         <w:rPr>
           <w:rStyle w:val="SourceText"/>
         </w:rPr>
-        <w:t xml:space="preserve">Запасы </w:t>
-      </w:r>
-      <w:r>
-        <w:rPr>
-          <w:rStyle w:val="SourceText"/>
-        </w:rPr>
-        <w:t xml:space="preserve">(N) → (1) </w:t>
-      </w:r>
-      <w:r>
-        <w:rPr>
-          <w:rStyle w:val="SourceText"/>
-        </w:rPr>
-        <w:t>Склад</w:t>
-      </w:r>
-    </w:p>
-    <w:p>
-      <w:pPr>
-        <w:pStyle w:val="BodyText"/>
-        <w:numPr>
-          <w:ilvl w:val="0"/>
-          <w:numId w:val="17"/>
-        </w:numPr>
-        <w:tabs>
-          <w:tab w:val="clear" w:pos="709"/>
-          <w:tab w:val="left" w:pos="709" w:leader="none"/>
-        </w:tabs>
-        <w:bidi w:val="0"/>
-        <w:ind w:hanging="283" w:start="709"/>
-        <w:jc w:val="start"/>
-        <w:rPr/>
-      </w:pPr>
-      <w:r>
-        <w:rPr>
-          <w:rStyle w:val="SourceText"/>
-        </w:rPr>
-        <w:t>Запасы</w:t>
-      </w:r>
-      <w:r>
-        <w:rPr>
-          <w:rStyle w:val="SourceText"/>
-        </w:rPr>
-        <w:t xml:space="preserve"> (N) → (1) </w:t>
-      </w:r>
-      <w:r>
-        <w:rPr>
-          <w:rStyle w:val="SourceText"/>
-        </w:rPr>
-        <w:t>Партия</w:t>
+        <w:t>Элемент_Корзины (N) → (1) Препарат</w:t>
       </w:r>
       <w:r>
         <w:rPr/>
         <w:t xml:space="preserve"> </w:t>
-      </w:r>
-    </w:p>
-    <w:p>
-      <w:pPr>
-        <w:pStyle w:val="Heading1"/>
-        <w:bidi w:val="0"/>
-        <w:spacing w:lineRule="auto" w:line="276" w:before="0" w:after="140"/>
-        <w:jc w:val="start"/>
-        <w:rPr/>
-      </w:pPr>
-      <w:r>
-        <w:rPr/>
-        <w:t>4. Корзина и заказы</w:t>
       </w:r>
     </w:p>
     <w:p>
@@ -1869,19 +1824,19 @@
           <w:i/>
           <w:iCs/>
         </w:rPr>
-        <w:t>4.1. Корзина</w:t>
-      </w:r>
-    </w:p>
-    <w:p>
-      <w:pPr>
-        <w:pStyle w:val="BodyText"/>
-        <w:bidi w:val="0"/>
-        <w:jc w:val="start"/>
-        <w:rPr/>
-      </w:pPr>
-      <w:r>
-        <w:rPr/>
-        <w:t>Корзина пользователя.</w:t>
+        <w:t>4.3. Заказ</w:t>
+      </w:r>
+    </w:p>
+    <w:p>
+      <w:pPr>
+        <w:pStyle w:val="BodyText"/>
+        <w:bidi w:val="0"/>
+        <w:jc w:val="start"/>
+        <w:rPr/>
+      </w:pPr>
+      <w:r>
+        <w:rPr/>
+        <w:t>Оформленный заказ.</w:t>
       </w:r>
     </w:p>
     <w:p>
@@ -1903,10 +1858,9 @@
         <w:pStyle w:val="BodyText"/>
         <w:numPr>
           <w:ilvl w:val="0"/>
-          <w:numId w:val="18"/>
+          <w:numId w:val="21"/>
         </w:numPr>
         <w:tabs>
-          <w:tab w:val="clear" w:pos="709"/>
           <w:tab w:val="left" w:pos="709" w:leader="none"/>
         </w:tabs>
         <w:bidi w:val="0"/>
@@ -1917,7 +1871,7 @@
       </w:pPr>
       <w:r>
         <w:rPr/>
-        <w:t xml:space="preserve">статус (активная, оформлена и т.п.) </w:t>
+        <w:t xml:space="preserve">итоговую сумму </w:t>
       </w:r>
     </w:p>
     <w:p>
@@ -1925,34 +1879,20 @@
         <w:pStyle w:val="BodyText"/>
         <w:numPr>
           <w:ilvl w:val="0"/>
-          <w:numId w:val="18"/>
+          <w:numId w:val="21"/>
         </w:numPr>
         <w:tabs>
-          <w:tab w:val="clear" w:pos="709"/>
           <w:tab w:val="left" w:pos="709" w:leader="none"/>
         </w:tabs>
         <w:bidi w:val="0"/>
+        <w:spacing w:before="0" w:after="0"/>
         <w:ind w:hanging="283" w:start="709"/>
         <w:jc w:val="start"/>
         <w:rPr/>
       </w:pPr>
       <w:r>
         <w:rPr/>
-        <w:t xml:space="preserve">даты создания/обновления </w:t>
-      </w:r>
-    </w:p>
-    <w:p>
-      <w:pPr>
-        <w:pStyle w:val="BodyText"/>
-        <w:bidi w:val="0"/>
-        <w:jc w:val="start"/>
-        <w:rPr/>
-      </w:pPr>
-      <w:r>
-        <w:rPr>
-          <w:rStyle w:val="Strong"/>
-        </w:rPr>
-        <w:t>Связи:</w:t>
+        <w:t xml:space="preserve">скидку </w:t>
       </w:r>
     </w:p>
     <w:p>
@@ -1960,10 +1900,9 @@
         <w:pStyle w:val="BodyText"/>
         <w:numPr>
           <w:ilvl w:val="0"/>
-          <w:numId w:val="19"/>
+          <w:numId w:val="21"/>
         </w:numPr>
         <w:tabs>
-          <w:tab w:val="clear" w:pos="709"/>
           <w:tab w:val="left" w:pos="709" w:leader="none"/>
         </w:tabs>
         <w:bidi w:val="0"/>
@@ -1973,22 +1912,8 @@
         <w:rPr/>
       </w:pPr>
       <w:r>
-        <w:rPr>
-          <w:rStyle w:val="SourceText"/>
-        </w:rPr>
-        <w:t>Корзина</w:t>
-      </w:r>
-      <w:r>
-        <w:rPr>
-          <w:rStyle w:val="SourceText"/>
-        </w:rPr>
-        <w:t xml:space="preserve"> (N) → (1) </w:t>
-      </w:r>
-      <w:r>
-        <w:rPr>
-          <w:rStyle w:val="SourceText"/>
-        </w:rPr>
-        <w:t>Пользователь</w:t>
+        <w:rPr/>
+        <w:t xml:space="preserve">тип доставки </w:t>
       </w:r>
     </w:p>
     <w:p>
@@ -1996,10 +1921,9 @@
         <w:pStyle w:val="BodyText"/>
         <w:numPr>
           <w:ilvl w:val="0"/>
-          <w:numId w:val="19"/>
+          <w:numId w:val="21"/>
         </w:numPr>
         <w:tabs>
-          <w:tab w:val="clear" w:pos="709"/>
           <w:tab w:val="left" w:pos="709" w:leader="none"/>
         </w:tabs>
         <w:bidi w:val="0"/>
@@ -2008,22 +1932,94 @@
         <w:rPr/>
       </w:pPr>
       <w:r>
+        <w:rPr/>
+        <w:t xml:space="preserve">статус </w:t>
+      </w:r>
+    </w:p>
+    <w:p>
+      <w:pPr>
+        <w:pStyle w:val="BodyText"/>
+        <w:bidi w:val="0"/>
+        <w:jc w:val="start"/>
+        <w:rPr/>
+      </w:pPr>
+      <w:r>
+        <w:rPr>
+          <w:rStyle w:val="Strong"/>
+        </w:rPr>
+        <w:t>Связи:</w:t>
+      </w:r>
+    </w:p>
+    <w:p>
+      <w:pPr>
+        <w:pStyle w:val="BodyText"/>
+        <w:numPr>
+          <w:ilvl w:val="0"/>
+          <w:numId w:val="22"/>
+        </w:numPr>
+        <w:tabs>
+          <w:tab w:val="left" w:pos="709" w:leader="none"/>
+        </w:tabs>
+        <w:bidi w:val="0"/>
+        <w:spacing w:before="0" w:after="0"/>
+        <w:ind w:hanging="283" w:start="709"/>
+        <w:jc w:val="start"/>
+        <w:rPr/>
+      </w:pPr>
+      <w:r>
         <w:rPr>
           <w:rStyle w:val="SourceText"/>
         </w:rPr>
-        <w:t xml:space="preserve">Корзина </w:t>
-      </w:r>
+        <w:t>Заказ (N) → (1) Пользователь</w:t>
+      </w:r>
+    </w:p>
+    <w:p>
+      <w:pPr>
+        <w:pStyle w:val="BodyText"/>
+        <w:numPr>
+          <w:ilvl w:val="0"/>
+          <w:numId w:val="22"/>
+        </w:numPr>
+        <w:tabs>
+          <w:tab w:val="left" w:pos="709" w:leader="none"/>
+        </w:tabs>
+        <w:bidi w:val="0"/>
+        <w:spacing w:before="0" w:after="0"/>
+        <w:ind w:hanging="283" w:start="709"/>
+        <w:jc w:val="start"/>
+        <w:rPr/>
+      </w:pPr>
       <w:r>
         <w:rPr>
           <w:rStyle w:val="SourceText"/>
         </w:rPr>
-        <w:t xml:space="preserve">(1) → (N) </w:t>
-      </w:r>
+        <w:t>Заказ (1) → (N) Элемент_Заказа</w:t>
+      </w:r>
+      <w:r>
+        <w:rPr/>
+        <w:t xml:space="preserve"> </w:t>
+      </w:r>
+    </w:p>
+    <w:p>
+      <w:pPr>
+        <w:pStyle w:val="BodyText"/>
+        <w:numPr>
+          <w:ilvl w:val="0"/>
+          <w:numId w:val="22"/>
+        </w:numPr>
+        <w:tabs>
+          <w:tab w:val="left" w:pos="709" w:leader="none"/>
+        </w:tabs>
+        <w:bidi w:val="0"/>
+        <w:ind w:hanging="283" w:start="709"/>
+        <w:jc w:val="start"/>
+        <w:rPr/>
+      </w:pPr>
       <w:r>
         <w:rPr>
           <w:rStyle w:val="SourceText"/>
         </w:rPr>
-        <w:t>Элемент_Корзины</w:t>
+        <w:t>Заказ (1) → (N) Резервация</w:t>
       </w:r>
       <w:r>
         <w:rPr/>
@@ -2046,19 +2042,19 @@
           <w:i/>
           <w:iCs/>
         </w:rPr>
-        <w:t>4.2. Элемент_Корзины</w:t>
-      </w:r>
-    </w:p>
-    <w:p>
-      <w:pPr>
-        <w:pStyle w:val="BodyText"/>
-        <w:bidi w:val="0"/>
-        <w:jc w:val="start"/>
-        <w:rPr/>
-      </w:pPr>
-      <w:r>
-        <w:rPr/>
-        <w:t>Позиции в корзине.</w:t>
+        <w:t>4.4. Элемент_Заказа</w:t>
+      </w:r>
+    </w:p>
+    <w:p>
+      <w:pPr>
+        <w:pStyle w:val="BodyText"/>
+        <w:bidi w:val="0"/>
+        <w:jc w:val="start"/>
+        <w:rPr/>
+      </w:pPr>
+      <w:r>
+        <w:rPr/>
+        <w:t>Конкретные позиции заказа (привязаны к партиям, а не просто к товарам).</w:t>
       </w:r>
     </w:p>
     <w:p>
@@ -2080,10 +2076,9 @@
         <w:pStyle w:val="BodyText"/>
         <w:numPr>
           <w:ilvl w:val="0"/>
-          <w:numId w:val="20"/>
+          <w:numId w:val="23"/>
         </w:numPr>
         <w:tabs>
-          <w:tab w:val="clear" w:pos="709"/>
           <w:tab w:val="left" w:pos="709" w:leader="none"/>
         </w:tabs>
         <w:bidi w:val="0"/>
@@ -2096,19 +2091,7 @@
         <w:rPr>
           <w:rStyle w:val="SourceText"/>
         </w:rPr>
-        <w:t>Элемент_Корзины</w:t>
-      </w:r>
-      <w:r>
-        <w:rPr>
-          <w:rStyle w:val="SourceText"/>
-        </w:rPr>
-        <w:t xml:space="preserve"> (N) → (1) </w:t>
-      </w:r>
-      <w:r>
-        <w:rPr>
-          <w:rStyle w:val="SourceText"/>
-        </w:rPr>
-        <w:t>Корзина</w:t>
+        <w:t>Элемент_Заказа (N) → (1) Заказ</w:t>
       </w:r>
       <w:r>
         <w:rPr/>
@@ -2120,10 +2103,9 @@
         <w:pStyle w:val="BodyText"/>
         <w:numPr>
           <w:ilvl w:val="0"/>
-          <w:numId w:val="20"/>
+          <w:numId w:val="23"/>
         </w:numPr>
         <w:tabs>
-          <w:tab w:val="clear" w:pos="709"/>
           <w:tab w:val="left" w:pos="709" w:leader="none"/>
         </w:tabs>
         <w:bidi w:val="0"/>
@@ -2135,19 +2117,7 @@
         <w:rPr>
           <w:rStyle w:val="SourceText"/>
         </w:rPr>
-        <w:t>Элемент_Корзины</w:t>
-      </w:r>
-      <w:r>
-        <w:rPr>
-          <w:rStyle w:val="SourceText"/>
-        </w:rPr>
-        <w:t xml:space="preserve"> (N) → (1) </w:t>
-      </w:r>
-      <w:r>
-        <w:rPr>
-          <w:rStyle w:val="SourceText"/>
-        </w:rPr>
-        <w:t>Препарат</w:t>
+        <w:t>Элемент_Заказа (N) → (1) Партия</w:t>
       </w:r>
       <w:r>
         <w:rPr/>
@@ -2170,391 +2140,6 @@
           <w:i/>
           <w:iCs/>
         </w:rPr>
-        <w:t>4.3. Заказ</w:t>
-      </w:r>
-    </w:p>
-    <w:p>
-      <w:pPr>
-        <w:pStyle w:val="BodyText"/>
-        <w:bidi w:val="0"/>
-        <w:jc w:val="start"/>
-        <w:rPr/>
-      </w:pPr>
-      <w:r>
-        <w:rPr/>
-        <w:t>Оформленный заказ.</w:t>
-      </w:r>
-    </w:p>
-    <w:p>
-      <w:pPr>
-        <w:pStyle w:val="BodyText"/>
-        <w:bidi w:val="0"/>
-        <w:jc w:val="start"/>
-        <w:rPr/>
-      </w:pPr>
-      <w:r>
-        <w:rPr>
-          <w:rStyle w:val="Strong"/>
-        </w:rPr>
-        <w:t>Содержит:</w:t>
-      </w:r>
-    </w:p>
-    <w:p>
-      <w:pPr>
-        <w:pStyle w:val="BodyText"/>
-        <w:numPr>
-          <w:ilvl w:val="0"/>
-          <w:numId w:val="21"/>
-        </w:numPr>
-        <w:tabs>
-          <w:tab w:val="clear" w:pos="709"/>
-          <w:tab w:val="left" w:pos="709" w:leader="none"/>
-        </w:tabs>
-        <w:bidi w:val="0"/>
-        <w:spacing w:before="0" w:after="0"/>
-        <w:ind w:hanging="283" w:start="709"/>
-        <w:jc w:val="start"/>
-        <w:rPr/>
-      </w:pPr>
-      <w:r>
-        <w:rPr/>
-        <w:t xml:space="preserve">итоговую сумму </w:t>
-      </w:r>
-    </w:p>
-    <w:p>
-      <w:pPr>
-        <w:pStyle w:val="BodyText"/>
-        <w:numPr>
-          <w:ilvl w:val="0"/>
-          <w:numId w:val="21"/>
-        </w:numPr>
-        <w:tabs>
-          <w:tab w:val="clear" w:pos="709"/>
-          <w:tab w:val="left" w:pos="709" w:leader="none"/>
-        </w:tabs>
-        <w:bidi w:val="0"/>
-        <w:spacing w:before="0" w:after="0"/>
-        <w:ind w:hanging="283" w:start="709"/>
-        <w:jc w:val="start"/>
-        <w:rPr/>
-      </w:pPr>
-      <w:r>
-        <w:rPr/>
-        <w:t xml:space="preserve">скидку </w:t>
-      </w:r>
-    </w:p>
-    <w:p>
-      <w:pPr>
-        <w:pStyle w:val="BodyText"/>
-        <w:numPr>
-          <w:ilvl w:val="0"/>
-          <w:numId w:val="21"/>
-        </w:numPr>
-        <w:tabs>
-          <w:tab w:val="clear" w:pos="709"/>
-          <w:tab w:val="left" w:pos="709" w:leader="none"/>
-        </w:tabs>
-        <w:bidi w:val="0"/>
-        <w:spacing w:before="0" w:after="0"/>
-        <w:ind w:hanging="283" w:start="709"/>
-        <w:jc w:val="start"/>
-        <w:rPr/>
-      </w:pPr>
-      <w:r>
-        <w:rPr/>
-        <w:t xml:space="preserve">тип доставки </w:t>
-      </w:r>
-    </w:p>
-    <w:p>
-      <w:pPr>
-        <w:pStyle w:val="BodyText"/>
-        <w:numPr>
-          <w:ilvl w:val="0"/>
-          <w:numId w:val="21"/>
-        </w:numPr>
-        <w:tabs>
-          <w:tab w:val="clear" w:pos="709"/>
-          <w:tab w:val="left" w:pos="709" w:leader="none"/>
-        </w:tabs>
-        <w:bidi w:val="0"/>
-        <w:ind w:hanging="283" w:start="709"/>
-        <w:jc w:val="start"/>
-        <w:rPr/>
-      </w:pPr>
-      <w:r>
-        <w:rPr/>
-        <w:t xml:space="preserve">статус </w:t>
-      </w:r>
-    </w:p>
-    <w:p>
-      <w:pPr>
-        <w:pStyle w:val="BodyText"/>
-        <w:bidi w:val="0"/>
-        <w:jc w:val="start"/>
-        <w:rPr/>
-      </w:pPr>
-      <w:r>
-        <w:rPr>
-          <w:rStyle w:val="Strong"/>
-        </w:rPr>
-        <w:t>Связи:</w:t>
-      </w:r>
-    </w:p>
-    <w:p>
-      <w:pPr>
-        <w:pStyle w:val="BodyText"/>
-        <w:numPr>
-          <w:ilvl w:val="0"/>
-          <w:numId w:val="22"/>
-        </w:numPr>
-        <w:tabs>
-          <w:tab w:val="clear" w:pos="709"/>
-          <w:tab w:val="left" w:pos="709" w:leader="none"/>
-        </w:tabs>
-        <w:bidi w:val="0"/>
-        <w:spacing w:before="0" w:after="0"/>
-        <w:ind w:hanging="283" w:start="709"/>
-        <w:jc w:val="start"/>
-        <w:rPr/>
-      </w:pPr>
-      <w:r>
-        <w:rPr>
-          <w:rStyle w:val="SourceText"/>
-        </w:rPr>
-        <w:t>Заказ</w:t>
-      </w:r>
-      <w:r>
-        <w:rPr>
-          <w:rStyle w:val="SourceText"/>
-        </w:rPr>
-        <w:t xml:space="preserve"> (N) → (1) </w:t>
-      </w:r>
-      <w:r>
-        <w:rPr>
-          <w:rStyle w:val="SourceText"/>
-        </w:rPr>
-        <w:t>Пользователь</w:t>
-      </w:r>
-    </w:p>
-    <w:p>
-      <w:pPr>
-        <w:pStyle w:val="BodyText"/>
-        <w:numPr>
-          <w:ilvl w:val="0"/>
-          <w:numId w:val="22"/>
-        </w:numPr>
-        <w:tabs>
-          <w:tab w:val="clear" w:pos="709"/>
-          <w:tab w:val="left" w:pos="709" w:leader="none"/>
-        </w:tabs>
-        <w:bidi w:val="0"/>
-        <w:spacing w:before="0" w:after="0"/>
-        <w:ind w:hanging="283" w:start="709"/>
-        <w:jc w:val="start"/>
-        <w:rPr/>
-      </w:pPr>
-      <w:r>
-        <w:rPr>
-          <w:rStyle w:val="SourceText"/>
-        </w:rPr>
-        <w:t>Заказ</w:t>
-      </w:r>
-      <w:r>
-        <w:rPr>
-          <w:rStyle w:val="SourceText"/>
-        </w:rPr>
-        <w:t xml:space="preserve"> (1) → (N) </w:t>
-      </w:r>
-      <w:r>
-        <w:rPr>
-          <w:rStyle w:val="SourceText"/>
-        </w:rPr>
-        <w:t>Элемент_Заказа</w:t>
-      </w:r>
-      <w:r>
-        <w:rPr/>
-        <w:t xml:space="preserve"> </w:t>
-      </w:r>
-    </w:p>
-    <w:p>
-      <w:pPr>
-        <w:pStyle w:val="BodyText"/>
-        <w:numPr>
-          <w:ilvl w:val="0"/>
-          <w:numId w:val="22"/>
-        </w:numPr>
-        <w:tabs>
-          <w:tab w:val="clear" w:pos="709"/>
-          <w:tab w:val="left" w:pos="709" w:leader="none"/>
-        </w:tabs>
-        <w:bidi w:val="0"/>
-        <w:ind w:hanging="283" w:start="709"/>
-        <w:jc w:val="start"/>
-        <w:rPr/>
-      </w:pPr>
-      <w:r>
-        <w:rPr>
-          <w:rStyle w:val="SourceText"/>
-        </w:rPr>
-        <w:t>Заказ</w:t>
-      </w:r>
-      <w:r>
-        <w:rPr>
-          <w:rStyle w:val="SourceText"/>
-        </w:rPr>
-        <w:t xml:space="preserve"> (1) → (N) </w:t>
-      </w:r>
-      <w:r>
-        <w:rPr>
-          <w:rStyle w:val="SourceText"/>
-        </w:rPr>
-        <w:t>Резервация</w:t>
-      </w:r>
-      <w:r>
-        <w:rPr/>
-        <w:t xml:space="preserve"> </w:t>
-      </w:r>
-    </w:p>
-    <w:p>
-      <w:pPr>
-        <w:pStyle w:val="Heading3"/>
-        <w:bidi w:val="0"/>
-        <w:spacing w:lineRule="auto" w:line="276" w:before="0" w:after="140"/>
-        <w:jc w:val="start"/>
-        <w:rPr/>
-      </w:pPr>
-      <w:r>
-        <w:rPr>
-          <w:rStyle w:val="Strong"/>
-          <w:b/>
-          <w:bCs/>
-          <w:i/>
-          <w:iCs/>
-        </w:rPr>
-        <w:t>4.4. Элемент_Заказа</w:t>
-      </w:r>
-    </w:p>
-    <w:p>
-      <w:pPr>
-        <w:pStyle w:val="BodyText"/>
-        <w:bidi w:val="0"/>
-        <w:jc w:val="start"/>
-        <w:rPr/>
-      </w:pPr>
-      <w:r>
-        <w:rPr/>
-        <w:t>Конкретные позиции заказа (привязаны к партиям, а не просто к товарам).</w:t>
-      </w:r>
-    </w:p>
-    <w:p>
-      <w:pPr>
-        <w:pStyle w:val="BodyText"/>
-        <w:bidi w:val="0"/>
-        <w:jc w:val="start"/>
-        <w:rPr/>
-      </w:pPr>
-      <w:r>
-        <w:rPr>
-          <w:rStyle w:val="Strong"/>
-        </w:rPr>
-        <w:t>Связи:</w:t>
-      </w:r>
-    </w:p>
-    <w:p>
-      <w:pPr>
-        <w:pStyle w:val="BodyText"/>
-        <w:numPr>
-          <w:ilvl w:val="0"/>
-          <w:numId w:val="23"/>
-        </w:numPr>
-        <w:tabs>
-          <w:tab w:val="clear" w:pos="709"/>
-          <w:tab w:val="left" w:pos="709" w:leader="none"/>
-        </w:tabs>
-        <w:bidi w:val="0"/>
-        <w:spacing w:before="0" w:after="0"/>
-        <w:ind w:hanging="283" w:start="709"/>
-        <w:jc w:val="start"/>
-        <w:rPr/>
-      </w:pPr>
-      <w:r>
-        <w:rPr>
-          <w:rStyle w:val="SourceText"/>
-        </w:rPr>
-        <w:t>Элемент_Заказа</w:t>
-      </w:r>
-      <w:r>
-        <w:rPr>
-          <w:rStyle w:val="SourceText"/>
-        </w:rPr>
-        <w:t xml:space="preserve"> (N) → (1) </w:t>
-      </w:r>
-      <w:r>
-        <w:rPr>
-          <w:rStyle w:val="SourceText"/>
-        </w:rPr>
-        <w:t>Заказ</w:t>
-      </w:r>
-      <w:r>
-        <w:rPr/>
-        <w:t xml:space="preserve"> </w:t>
-      </w:r>
-    </w:p>
-    <w:p>
-      <w:pPr>
-        <w:pStyle w:val="BodyText"/>
-        <w:numPr>
-          <w:ilvl w:val="0"/>
-          <w:numId w:val="23"/>
-        </w:numPr>
-        <w:tabs>
-          <w:tab w:val="clear" w:pos="709"/>
-          <w:tab w:val="left" w:pos="709" w:leader="none"/>
-        </w:tabs>
-        <w:bidi w:val="0"/>
-        <w:ind w:hanging="283" w:start="709"/>
-        <w:jc w:val="start"/>
-        <w:rPr/>
-      </w:pPr>
-      <w:r>
-        <w:rPr>
-          <w:rStyle w:val="SourceText"/>
-        </w:rPr>
-        <w:t>Элемент_Заказа</w:t>
-      </w:r>
-      <w:r>
-        <w:rPr>
-          <w:rStyle w:val="SourceText"/>
-        </w:rPr>
-        <w:t xml:space="preserve"> (N) → (1) </w:t>
-      </w:r>
-      <w:r>
-        <w:rPr>
-          <w:rStyle w:val="SourceText"/>
-        </w:rPr>
-        <w:t>Партия</w:t>
-      </w:r>
-      <w:r>
-        <w:rPr/>
-        <w:t xml:space="preserve"> </w:t>
-      </w:r>
-    </w:p>
-    <w:p>
-      <w:pPr>
-        <w:pStyle w:val="Heading3"/>
-        <w:bidi w:val="0"/>
-        <w:spacing w:lineRule="auto" w:line="276" w:before="0" w:after="140"/>
-        <w:jc w:val="start"/>
-        <w:rPr/>
-      </w:pPr>
-      <w:r>
-        <w:rPr>
-          <w:rStyle w:val="Strong"/>
-          <w:b/>
-          <w:bCs/>
-          <w:i/>
-          <w:iCs/>
-        </w:rPr>
         <w:t>4.5. Резервация</w:t>
       </w:r>
     </w:p>
@@ -2592,7 +2177,6 @@
           <w:numId w:val="24"/>
         </w:numPr>
         <w:tabs>
-          <w:tab w:val="clear" w:pos="709"/>
           <w:tab w:val="left" w:pos="709" w:leader="none"/>
         </w:tabs>
         <w:bidi w:val="0"/>
@@ -2614,7 +2198,6 @@
           <w:numId w:val="24"/>
         </w:numPr>
         <w:tabs>
-          <w:tab w:val="clear" w:pos="709"/>
           <w:tab w:val="left" w:pos="709" w:leader="none"/>
         </w:tabs>
         <w:bidi w:val="0"/>
@@ -2649,7 +2232,6 @@
           <w:numId w:val="25"/>
         </w:numPr>
         <w:tabs>
-          <w:tab w:val="clear" w:pos="709"/>
           <w:tab w:val="left" w:pos="709" w:leader="none"/>
         </w:tabs>
         <w:bidi w:val="0"/>
@@ -2662,19 +2244,7 @@
         <w:rPr>
           <w:rStyle w:val="SourceText"/>
         </w:rPr>
-        <w:t>Резервация</w:t>
-      </w:r>
-      <w:r>
-        <w:rPr>
-          <w:rStyle w:val="SourceText"/>
-        </w:rPr>
-        <w:t xml:space="preserve"> (N) → (1) </w:t>
-      </w:r>
-      <w:r>
-        <w:rPr>
-          <w:rStyle w:val="SourceText"/>
-        </w:rPr>
-        <w:t>Партия</w:t>
+        <w:t>Резервация (N) → (1) Партия</w:t>
       </w:r>
       <w:r>
         <w:rPr/>
@@ -2689,7 +2259,6 @@
           <w:numId w:val="25"/>
         </w:numPr>
         <w:tabs>
-          <w:tab w:val="clear" w:pos="709"/>
           <w:tab w:val="left" w:pos="709" w:leader="none"/>
         </w:tabs>
         <w:bidi w:val="0"/>
@@ -2702,19 +2271,7 @@
         <w:rPr>
           <w:rStyle w:val="SourceText"/>
         </w:rPr>
-        <w:t>Резервация</w:t>
-      </w:r>
-      <w:r>
-        <w:rPr>
-          <w:rStyle w:val="SourceText"/>
-        </w:rPr>
-        <w:t xml:space="preserve"> (N) → (1) </w:t>
-      </w:r>
-      <w:r>
-        <w:rPr>
-          <w:rStyle w:val="SourceText"/>
-        </w:rPr>
-        <w:t>Заказ</w:t>
+        <w:t>Резервация (N) → (1) Заказ</w:t>
       </w:r>
     </w:p>
     <w:sectPr>
@@ -2724,6 +2281,7 @@
       <w:pgNumType w:fmt="decimal"/>
       <w:formProt w:val="false"/>
       <w:textDirection w:val="lrTb"/>
+      <w:docGrid w:type="default" w:linePitch="100" w:charSpace="0"/>
     </w:sectPr>
   </w:body>
 </w:document>
@@ -2735,7 +2293,6 @@
     <w:lvl w:ilvl="0">
       <w:start w:val="1"/>
       <w:numFmt w:val="none"/>
-      <w:pStyle w:val="Heading1"/>
       <w:suff w:val="nothing"/>
       <w:lvlText w:val=""/>
       <w:lvlJc w:val="start"/>
@@ -2745,6 +2302,7 @@
         </w:tabs>
         <w:ind w:start="0" w:hanging="0"/>
       </w:pPr>
+      <w:rPr/>
     </w:lvl>
     <w:lvl w:ilvl="1">
       <w:start w:val="1"/>
@@ -2758,11 +2316,11 @@
         </w:tabs>
         <w:ind w:start="0" w:hanging="0"/>
       </w:pPr>
+      <w:rPr/>
     </w:lvl>
     <w:lvl w:ilvl="2">
       <w:start w:val="1"/>
       <w:numFmt w:val="none"/>
-      <w:pStyle w:val="Heading3"/>
       <w:suff w:val="nothing"/>
       <w:lvlText w:val=""/>
       <w:lvlJc w:val="start"/>
@@ -2772,11 +2330,11 @@
         </w:tabs>
         <w:ind w:start="0" w:hanging="0"/>
       </w:pPr>
+      <w:rPr/>
     </w:lvl>
     <w:lvl w:ilvl="3">
       <w:start w:val="1"/>
       <w:numFmt w:val="none"/>
-      <w:pStyle w:val="Heading4"/>
       <w:suff w:val="nothing"/>
       <w:lvlText w:val=""/>
       <w:lvlJc w:val="start"/>
@@ -2786,11 +2344,11 @@
         </w:tabs>
         <w:ind w:start="0" w:hanging="0"/>
       </w:pPr>
+      <w:rPr/>
     </w:lvl>
     <w:lvl w:ilvl="4">
       <w:start w:val="1"/>
       <w:numFmt w:val="none"/>
-      <w:pStyle w:val="Heading5"/>
       <w:suff w:val="nothing"/>
       <w:lvlText w:val=""/>
       <w:lvlJc w:val="start"/>
@@ -2800,11 +2358,11 @@
         </w:tabs>
         <w:ind w:start="0" w:hanging="0"/>
       </w:pPr>
+      <w:rPr/>
     </w:lvl>
     <w:lvl w:ilvl="5">
       <w:start w:val="1"/>
       <w:numFmt w:val="none"/>
-      <w:pStyle w:val="Heading6"/>
       <w:suff w:val="nothing"/>
       <w:lvlText w:val=""/>
       <w:lvlJc w:val="start"/>
@@ -2814,11 +2372,11 @@
         </w:tabs>
         <w:ind w:start="0" w:hanging="0"/>
       </w:pPr>
+      <w:rPr/>
     </w:lvl>
     <w:lvl w:ilvl="6">
       <w:start w:val="1"/>
       <w:numFmt w:val="none"/>
-      <w:pStyle w:val="Heading7"/>
       <w:suff w:val="nothing"/>
       <w:lvlText w:val=""/>
       <w:lvlJc w:val="start"/>
@@ -2828,11 +2386,11 @@
         </w:tabs>
         <w:ind w:start="0" w:hanging="0"/>
       </w:pPr>
+      <w:rPr/>
     </w:lvl>
     <w:lvl w:ilvl="7">
       <w:start w:val="1"/>
       <w:numFmt w:val="none"/>
-      <w:pStyle w:val="Heading8"/>
       <w:suff w:val="nothing"/>
       <w:lvlText w:val=""/>
       <w:lvlJc w:val="start"/>
@@ -2842,11 +2400,11 @@
         </w:tabs>
         <w:ind w:start="0" w:hanging="0"/>
       </w:pPr>
+      <w:rPr/>
     </w:lvl>
     <w:lvl w:ilvl="8">
       <w:start w:val="1"/>
       <w:numFmt w:val="none"/>
-      <w:pStyle w:val="Heading9"/>
       <w:suff w:val="nothing"/>
       <w:lvlText w:val=""/>
       <w:lvlJc w:val="start"/>
@@ -2856,6 +2414,7 @@
         </w:tabs>
         <w:ind w:start="0" w:hanging="0"/>
       </w:pPr>
+      <w:rPr/>
     </w:lvl>
   </w:abstractNum>
   <w:abstractNum w:abstractNumId="2">
@@ -6144,6 +5703,125 @@
       <w:rPr>
         <w:rFonts w:ascii="Symbol" w:hAnsi="Symbol" w:cs="Symbol" w:hint="default"/>
       </w:rPr>
+    </w:lvl>
+  </w:abstractNum>
+  <w:abstractNum w:abstractNumId="26">
+    <w:lvl w:ilvl="0">
+      <w:start w:val="1"/>
+      <w:numFmt w:val="none"/>
+      <w:suff w:val="nothing"/>
+      <w:lvlText w:val=""/>
+      <w:lvlJc w:val="start"/>
+      <w:pPr>
+        <w:tabs>
+          <w:tab w:val="num" w:pos="0"/>
+        </w:tabs>
+        <w:ind w:start="0" w:hanging="0"/>
+      </w:pPr>
+    </w:lvl>
+    <w:lvl w:ilvl="1">
+      <w:start w:val="1"/>
+      <w:numFmt w:val="none"/>
+      <w:suff w:val="nothing"/>
+      <w:lvlText w:val=""/>
+      <w:lvlJc w:val="start"/>
+      <w:pPr>
+        <w:tabs>
+          <w:tab w:val="num" w:pos="0"/>
+        </w:tabs>
+        <w:ind w:start="0" w:hanging="0"/>
+      </w:pPr>
+    </w:lvl>
+    <w:lvl w:ilvl="2">
+      <w:start w:val="1"/>
+      <w:numFmt w:val="none"/>
+      <w:suff w:val="nothing"/>
+      <w:lvlText w:val=""/>
+      <w:lvlJc w:val="start"/>
+      <w:pPr>
+        <w:tabs>
+          <w:tab w:val="num" w:pos="0"/>
+        </w:tabs>
+        <w:ind w:start="0" w:hanging="0"/>
+      </w:pPr>
+    </w:lvl>
+    <w:lvl w:ilvl="3">
+      <w:start w:val="1"/>
+      <w:numFmt w:val="none"/>
+      <w:suff w:val="nothing"/>
+      <w:lvlText w:val=""/>
+      <w:lvlJc w:val="start"/>
+      <w:pPr>
+        <w:tabs>
+          <w:tab w:val="num" w:pos="0"/>
+        </w:tabs>
+        <w:ind w:start="0" w:hanging="0"/>
+      </w:pPr>
+    </w:lvl>
+    <w:lvl w:ilvl="4">
+      <w:start w:val="1"/>
+      <w:numFmt w:val="none"/>
+      <w:suff w:val="nothing"/>
+      <w:lvlText w:val=""/>
+      <w:lvlJc w:val="start"/>
+      <w:pPr>
+        <w:tabs>
+          <w:tab w:val="num" w:pos="0"/>
+        </w:tabs>
+        <w:ind w:start="0" w:hanging="0"/>
+      </w:pPr>
+    </w:lvl>
+    <w:lvl w:ilvl="5">
+      <w:start w:val="1"/>
+      <w:numFmt w:val="none"/>
+      <w:suff w:val="nothing"/>
+      <w:lvlText w:val=""/>
+      <w:lvlJc w:val="start"/>
+      <w:pPr>
+        <w:tabs>
+          <w:tab w:val="num" w:pos="0"/>
+        </w:tabs>
+        <w:ind w:start="0" w:hanging="0"/>
+      </w:pPr>
+    </w:lvl>
+    <w:lvl w:ilvl="6">
+      <w:start w:val="1"/>
+      <w:numFmt w:val="none"/>
+      <w:suff w:val="nothing"/>
+      <w:lvlText w:val=""/>
+      <w:lvlJc w:val="start"/>
+      <w:pPr>
+        <w:tabs>
+          <w:tab w:val="num" w:pos="0"/>
+        </w:tabs>
+        <w:ind w:start="0" w:hanging="0"/>
+      </w:pPr>
+    </w:lvl>
+    <w:lvl w:ilvl="7">
+      <w:start w:val="1"/>
+      <w:numFmt w:val="none"/>
+      <w:suff w:val="nothing"/>
+      <w:lvlText w:val=""/>
+      <w:lvlJc w:val="start"/>
+      <w:pPr>
+        <w:tabs>
+          <w:tab w:val="num" w:pos="0"/>
+        </w:tabs>
+        <w:ind w:start="0" w:hanging="0"/>
+      </w:pPr>
+    </w:lvl>
+    <w:lvl w:ilvl="8">
+      <w:start w:val="1"/>
+      <w:numFmt w:val="none"/>
+      <w:suff w:val="nothing"/>
+      <w:lvlText w:val=""/>
+      <w:lvlJc w:val="start"/>
+      <w:pPr>
+        <w:tabs>
+          <w:tab w:val="num" w:pos="0"/>
+        </w:tabs>
+        <w:ind w:start="0" w:hanging="0"/>
+      </w:pPr>
     </w:lvl>
   </w:abstractNum>
   <w:num w:numId="1">
@@ -6221,6 +5899,9 @@
   <w:num w:numId="25">
     <w:abstractNumId w:val="25"/>
   </w:num>
+  <w:num w:numId="26">
+    <w:abstractNumId w:val="26"/>
+  </w:num>
 </w:numbering>
 </file>
 
@@ -6238,7 +5919,6 @@
     </w:rPrDefault>
     <w:pPrDefault>
       <w:pPr>
-        <w:widowControl/>
         <w:suppressAutoHyphens w:val="true"/>
       </w:pPr>
     </w:pPrDefault>
@@ -6248,7 +5928,10 @@
     <w:qFormat/>
     <w:pPr>
       <w:widowControl/>
+      <w:suppressAutoHyphens w:val="true"/>
       <w:bidi w:val="0"/>
+      <w:spacing w:before="0" w:after="0"/>
+      <w:jc w:val="start"/>
     </w:pPr>
     <w:rPr>
       <w:rFonts w:ascii="Noto Serif" w:hAnsi="Noto Serif" w:eastAsia="Noto Serif CJK SC" w:cs="Noto Sans Devanagari"/>
@@ -6427,8 +6110,8 @@
       <w:bCs/>
     </w:rPr>
   </w:style>
-  <w:style w:type="character" w:styleId="Bullets">
-    <w:name w:val="Bullets"/>
+  <w:style w:type="character" w:styleId="Bulletsuser">
+    <w:name w:val="Bullets (user)"/>
     <w:qFormat/>
     <w:rPr>
       <w:rFonts w:ascii="OpenSymbol" w:hAnsi="OpenSymbol" w:eastAsia="OpenSymbol" w:cs="OpenSymbol"/>

</xml_diff>